<commit_message>
Expand all 8 media docs to 185K+ words total
Before: 111K words → After: 185K+ words (66% expansion)

Added to all docs: detailed casting, sponsorship playbooks, international
strategy, merch/events, content calendars, 12 contestant profiles,
episode-by-episode brand partners, draft mechanics, 50 episode themes,
24 creator profiles, podcast episode guides, themed seasons, community
building, algorithm optimization, monetization deep dives, competitor
analysis, exit strategies, fundraising roadmap, 80+ suggestions.

Co-Authored-By: Claude Opus 4.6 (1M context) <noreply@anthropic.com>
</commit_message>
<xml_diff>
--- a/docs/PART2_TV_SHOW_ADDITIONAL_CONCEPTS.docx
+++ b/docs/PART2_TV_SHOW_ADDITIONAL_CONCEPTS.docx
@@ -1667,34 +1667,58 @@
         </w:rPr>
         <w:t xml:space="preserve">Executive Level (Total: 4)</w:t>
       </w:r>
-      <w:r>
-        <w:t xml:space="preserve"> </w:t>
-      </w:r>
-      <w:r>
-        <w:t xml:space="preserve">- Showrunner / Executive Producer: Responsible for editorial vision, network relationship, and overall narrative arc. Must have documentary AND reality television experience. Ideal candidate has worked on Selling Sunset, The Profit, or similar business docuseries.</w:t>
-      </w:r>
-      <w:r>
-        <w:t xml:space="preserve"> </w:t>
-      </w:r>
-      <w:r>
-        <w:t xml:space="preserve">- Executive Producer (DealStage / Brand side): In-house DealStage executive who ensures platform integration is accurate, compelling, and conversion-optimized. Acts as liaison between production and DealStage product team.</w:t>
-      </w:r>
-      <w:r>
-        <w:t xml:space="preserve"> </w:t>
-      </w:r>
-      <w:r>
-        <w:t xml:space="preserve">- Co-Executive Producer (Legal / Clearances): Manages the complex legal landscape of filming real business negotiations — NDA waivers, release agreements with talent clients, brand appearance agreements.</w:t>
-      </w:r>
-      <w:r>
-        <w:t xml:space="preserve"> </w:t>
-      </w:r>
-      <w:r>
-        <w:t xml:space="preserve">- Network EP (appointed by streaming partner): Provides platform perspective on audience and tone.</w:t>
-      </w:r>
-    </w:p>
-    <w:p>
-      <w:pPr>
-        <w:pStyle w:val="BodyText"/>
+    </w:p>
+    <w:p>
+      <w:pPr>
+        <w:pStyle w:val="Compact"/>
+        <w:numPr>
+          <w:ilvl w:val="0"/>
+          <w:numId w:val="1011"/>
+        </w:numPr>
+      </w:pPr>
+      <w:r>
+        <w:t xml:space="preserve">Showrunner / Executive Producer: Responsible for editorial vision, network relationship, and overall narrative arc. Must have documentary AND reality television experience. Ideal candidate has worked on Selling Sunset, The Profit, or similar business docuseries.</w:t>
+      </w:r>
+    </w:p>
+    <w:p>
+      <w:pPr>
+        <w:pStyle w:val="Compact"/>
+        <w:numPr>
+          <w:ilvl w:val="0"/>
+          <w:numId w:val="1011"/>
+        </w:numPr>
+      </w:pPr>
+      <w:r>
+        <w:t xml:space="preserve">Executive Producer (DealStage / Brand side): In-house DealStage executive who ensures platform integration is accurate, compelling, and conversion-optimized. Acts as liaison between production and DealStage product team.</w:t>
+      </w:r>
+    </w:p>
+    <w:p>
+      <w:pPr>
+        <w:pStyle w:val="Compact"/>
+        <w:numPr>
+          <w:ilvl w:val="0"/>
+          <w:numId w:val="1011"/>
+        </w:numPr>
+      </w:pPr>
+      <w:r>
+        <w:t xml:space="preserve">Co-Executive Producer (Legal / Clearances): Manages the complex legal landscape of filming real business negotiations — NDA waivers, release agreements with talent clients, brand appearance agreements.</w:t>
+      </w:r>
+    </w:p>
+    <w:p>
+      <w:pPr>
+        <w:pStyle w:val="Compact"/>
+        <w:numPr>
+          <w:ilvl w:val="0"/>
+          <w:numId w:val="1011"/>
+        </w:numPr>
+      </w:pPr>
+      <w:r>
+        <w:t xml:space="preserve">Network EP (appointed by streaming partner): Provides platform perspective on audience and tone.</w:t>
+      </w:r>
+    </w:p>
+    <w:p>
+      <w:pPr>
+        <w:pStyle w:val="FirstParagraph"/>
       </w:pPr>
       <w:r>
         <w:rPr>
@@ -1703,40 +1727,70 @@
         </w:rPr>
         <w:t xml:space="preserve">Production Leadership (Total: 6)</w:t>
       </w:r>
-      <w:r>
-        <w:t xml:space="preserve"> </w:t>
-      </w:r>
-      <w:r>
-        <w:t xml:space="preserve">- Line Producer: Day-to-day budget control, logistics, and scheduling across all filming locations</w:t>
-      </w:r>
-      <w:r>
-        <w:t xml:space="preserve"> </w:t>
-      </w:r>
-      <w:r>
-        <w:t xml:space="preserve">- Supervising Producer: Manages story development, character arcs, and episode structure</w:t>
-      </w:r>
-      <w:r>
-        <w:t xml:space="preserve"> </w:t>
-      </w:r>
-      <w:r>
-        <w:t xml:space="preserve">- 2 x Field Producers: Embedded with specific agents to develop their ongoing storylines</w:t>
-      </w:r>
-      <w:r>
-        <w:t xml:space="preserve"> </w:t>
-      </w:r>
-      <w:r>
-        <w:t xml:space="preserve">- Production Coordinator: Logistics hub for multi-location production</w:t>
-      </w:r>
-      <w:r>
-        <w:t xml:space="preserve"> </w:t>
-      </w:r>
-      <w:r>
-        <w:t xml:space="preserve">- Post Production Supervisor: Manages post timeline and delivery</w:t>
-      </w:r>
-    </w:p>
-    <w:p>
-      <w:pPr>
-        <w:pStyle w:val="BodyText"/>
+    </w:p>
+    <w:p>
+      <w:pPr>
+        <w:pStyle w:val="Compact"/>
+        <w:numPr>
+          <w:ilvl w:val="0"/>
+          <w:numId w:val="1012"/>
+        </w:numPr>
+      </w:pPr>
+      <w:r>
+        <w:t xml:space="preserve">Line Producer: Day-to-day budget control, logistics, and scheduling across all filming locations</w:t>
+      </w:r>
+    </w:p>
+    <w:p>
+      <w:pPr>
+        <w:pStyle w:val="Compact"/>
+        <w:numPr>
+          <w:ilvl w:val="0"/>
+          <w:numId w:val="1012"/>
+        </w:numPr>
+      </w:pPr>
+      <w:r>
+        <w:t xml:space="preserve">Supervising Producer: Manages story development, character arcs, and episode structure</w:t>
+      </w:r>
+    </w:p>
+    <w:p>
+      <w:pPr>
+        <w:pStyle w:val="Compact"/>
+        <w:numPr>
+          <w:ilvl w:val="0"/>
+          <w:numId w:val="1012"/>
+        </w:numPr>
+      </w:pPr>
+      <w:r>
+        <w:t xml:space="preserve">2 x Field Producers: Embedded with specific agents to develop their ongoing storylines</w:t>
+      </w:r>
+    </w:p>
+    <w:p>
+      <w:pPr>
+        <w:pStyle w:val="Compact"/>
+        <w:numPr>
+          <w:ilvl w:val="0"/>
+          <w:numId w:val="1012"/>
+        </w:numPr>
+      </w:pPr>
+      <w:r>
+        <w:t xml:space="preserve">Production Coordinator: Logistics hub for multi-location production</w:t>
+      </w:r>
+    </w:p>
+    <w:p>
+      <w:pPr>
+        <w:pStyle w:val="Compact"/>
+        <w:numPr>
+          <w:ilvl w:val="0"/>
+          <w:numId w:val="1012"/>
+        </w:numPr>
+      </w:pPr>
+      <w:r>
+        <w:t xml:space="preserve">Post Production Supervisor: Manages post timeline and delivery</w:t>
+      </w:r>
+    </w:p>
+    <w:p>
+      <w:pPr>
+        <w:pStyle w:val="FirstParagraph"/>
       </w:pPr>
       <w:r>
         <w:rPr>
@@ -1745,46 +1799,82 @@
         </w:rPr>
         <w:t xml:space="preserve">Camera and Sound (Total: 14)</w:t>
       </w:r>
-      <w:r>
-        <w:t xml:space="preserve"> </w:t>
-      </w:r>
-      <w:r>
-        <w:t xml:space="preserve">- 4 x Documentary Camera Operators (one per primary agent storyline filming simultaneously)</w:t>
-      </w:r>
-      <w:r>
-        <w:t xml:space="preserve"> </w:t>
-      </w:r>
-      <w:r>
-        <w:t xml:space="preserve">- 2 x Additional Camera Operators (for event coverage — pitch meetings, presentations, dinners)</w:t>
-      </w:r>
-      <w:r>
-        <w:t xml:space="preserve"> </w:t>
-      </w:r>
-      <w:r>
-        <w:t xml:space="preserve">- 4 x Sound Recordists / Boom Operators (one per active camera unit)</w:t>
-      </w:r>
-      <w:r>
-        <w:t xml:space="preserve"> </w:t>
-      </w:r>
-      <w:r>
-        <w:t xml:space="preserve">- 1 x Director of Photography (supervises visual language, B-roll, interview setups)</w:t>
-      </w:r>
-      <w:r>
-        <w:t xml:space="preserve"> </w:t>
-      </w:r>
-      <w:r>
-        <w:t xml:space="preserve">- 2 x Editors (in-production editors for daily review and story identification)</w:t>
-      </w:r>
-      <w:r>
-        <w:t xml:space="preserve"> </w:t>
-      </w:r>
-      <w:r>
-        <w:t xml:space="preserve">- 1 x Assistant Camera / Equipment Manager</w:t>
-      </w:r>
-    </w:p>
-    <w:p>
-      <w:pPr>
-        <w:pStyle w:val="BodyText"/>
+    </w:p>
+    <w:p>
+      <w:pPr>
+        <w:pStyle w:val="Compact"/>
+        <w:numPr>
+          <w:ilvl w:val="0"/>
+          <w:numId w:val="1013"/>
+        </w:numPr>
+      </w:pPr>
+      <w:r>
+        <w:t xml:space="preserve">4 x Documentary Camera Operators (one per primary agent storyline filming simultaneously)</w:t>
+      </w:r>
+    </w:p>
+    <w:p>
+      <w:pPr>
+        <w:pStyle w:val="Compact"/>
+        <w:numPr>
+          <w:ilvl w:val="0"/>
+          <w:numId w:val="1013"/>
+        </w:numPr>
+      </w:pPr>
+      <w:r>
+        <w:t xml:space="preserve">2 x Additional Camera Operators (for event coverage — pitch meetings, presentations, dinners)</w:t>
+      </w:r>
+    </w:p>
+    <w:p>
+      <w:pPr>
+        <w:pStyle w:val="Compact"/>
+        <w:numPr>
+          <w:ilvl w:val="0"/>
+          <w:numId w:val="1013"/>
+        </w:numPr>
+      </w:pPr>
+      <w:r>
+        <w:t xml:space="preserve">4 x Sound Recordists / Boom Operators (one per active camera unit)</w:t>
+      </w:r>
+    </w:p>
+    <w:p>
+      <w:pPr>
+        <w:pStyle w:val="Compact"/>
+        <w:numPr>
+          <w:ilvl w:val="0"/>
+          <w:numId w:val="1013"/>
+        </w:numPr>
+      </w:pPr>
+      <w:r>
+        <w:t xml:space="preserve">1 x Director of Photography (supervises visual language, B-roll, interview setups)</w:t>
+      </w:r>
+    </w:p>
+    <w:p>
+      <w:pPr>
+        <w:pStyle w:val="Compact"/>
+        <w:numPr>
+          <w:ilvl w:val="0"/>
+          <w:numId w:val="1013"/>
+        </w:numPr>
+      </w:pPr>
+      <w:r>
+        <w:t xml:space="preserve">2 x Editors (in-production editors for daily review and story identification)</w:t>
+      </w:r>
+    </w:p>
+    <w:p>
+      <w:pPr>
+        <w:pStyle w:val="Compact"/>
+        <w:numPr>
+          <w:ilvl w:val="0"/>
+          <w:numId w:val="1013"/>
+        </w:numPr>
+      </w:pPr>
+      <w:r>
+        <w:t xml:space="preserve">1 x Assistant Camera / Equipment Manager</w:t>
+      </w:r>
+    </w:p>
+    <w:p>
+      <w:pPr>
+        <w:pStyle w:val="FirstParagraph"/>
       </w:pPr>
       <w:r>
         <w:rPr>
@@ -1793,34 +1883,58 @@
         </w:rPr>
         <w:t xml:space="preserve">Story Department (Total: 8)</w:t>
       </w:r>
-      <w:r>
-        <w:t xml:space="preserve"> </w:t>
-      </w:r>
-      <w:r>
-        <w:t xml:space="preserve">- 3 x Story Producers (each managing 2-3 agents’ storylines, identifying narrative moments, briefing producers on emerging situations)</w:t>
-      </w:r>
-      <w:r>
-        <w:t xml:space="preserve"> </w:t>
-      </w:r>
-      <w:r>
-        <w:t xml:space="preserve">- 2 x Field Story Producers (on the ground with camera units)</w:t>
-      </w:r>
-      <w:r>
-        <w:t xml:space="preserve"> </w:t>
-      </w:r>
-      <w:r>
-        <w:t xml:space="preserve">- 2 x Researchers (background on brands, deals, and industry context — feeds the information graphics and DealStage on-screen overlays)</w:t>
-      </w:r>
-      <w:r>
-        <w:t xml:space="preserve"> </w:t>
-      </w:r>
-      <w:r>
-        <w:t xml:space="preserve">- 1 x Story Coordinator</w:t>
-      </w:r>
-    </w:p>
-    <w:p>
-      <w:pPr>
-        <w:pStyle w:val="BodyText"/>
+    </w:p>
+    <w:p>
+      <w:pPr>
+        <w:pStyle w:val="Compact"/>
+        <w:numPr>
+          <w:ilvl w:val="0"/>
+          <w:numId w:val="1014"/>
+        </w:numPr>
+      </w:pPr>
+      <w:r>
+        <w:t xml:space="preserve">3 x Story Producers (each managing 2-3 agents’ storylines, identifying narrative moments, briefing producers on emerging situations)</w:t>
+      </w:r>
+    </w:p>
+    <w:p>
+      <w:pPr>
+        <w:pStyle w:val="Compact"/>
+        <w:numPr>
+          <w:ilvl w:val="0"/>
+          <w:numId w:val="1014"/>
+        </w:numPr>
+      </w:pPr>
+      <w:r>
+        <w:t xml:space="preserve">2 x Field Story Producers (on the ground with camera units)</w:t>
+      </w:r>
+    </w:p>
+    <w:p>
+      <w:pPr>
+        <w:pStyle w:val="Compact"/>
+        <w:numPr>
+          <w:ilvl w:val="0"/>
+          <w:numId w:val="1014"/>
+        </w:numPr>
+      </w:pPr>
+      <w:r>
+        <w:t xml:space="preserve">2 x Researchers (background on brands, deals, and industry context — feeds the information graphics and DealStage on-screen overlays)</w:t>
+      </w:r>
+    </w:p>
+    <w:p>
+      <w:pPr>
+        <w:pStyle w:val="Compact"/>
+        <w:numPr>
+          <w:ilvl w:val="0"/>
+          <w:numId w:val="1014"/>
+        </w:numPr>
+      </w:pPr>
+      <w:r>
+        <w:t xml:space="preserve">1 x Story Coordinator</w:t>
+      </w:r>
+    </w:p>
+    <w:p>
+      <w:pPr>
+        <w:pStyle w:val="FirstParagraph"/>
       </w:pPr>
       <w:r>
         <w:rPr>
@@ -1829,28 +1943,46 @@
         </w:rPr>
         <w:t xml:space="preserve">Interview and Talking Head Team (Total: 3)</w:t>
       </w:r>
-      <w:r>
-        <w:t xml:space="preserve"> </w:t>
-      </w:r>
-      <w:r>
-        <w:t xml:space="preserve">- 1 x Interview Director (dedicated to setting up and conducting confessional interviews)</w:t>
-      </w:r>
-      <w:r>
-        <w:t xml:space="preserve"> </w:t>
-      </w:r>
-      <w:r>
-        <w:t xml:space="preserve">- 1 x Interview Camera Operator</w:t>
-      </w:r>
-      <w:r>
-        <w:t xml:space="preserve"> </w:t>
-      </w:r>
-      <w:r>
-        <w:t xml:space="preserve">- 1 x Interview Sound Recordist</w:t>
-      </w:r>
-    </w:p>
-    <w:p>
-      <w:pPr>
-        <w:pStyle w:val="BodyText"/>
+    </w:p>
+    <w:p>
+      <w:pPr>
+        <w:pStyle w:val="Compact"/>
+        <w:numPr>
+          <w:ilvl w:val="0"/>
+          <w:numId w:val="1015"/>
+        </w:numPr>
+      </w:pPr>
+      <w:r>
+        <w:t xml:space="preserve">1 x Interview Director (dedicated to setting up and conducting confessional interviews)</w:t>
+      </w:r>
+    </w:p>
+    <w:p>
+      <w:pPr>
+        <w:pStyle w:val="Compact"/>
+        <w:numPr>
+          <w:ilvl w:val="0"/>
+          <w:numId w:val="1015"/>
+        </w:numPr>
+      </w:pPr>
+      <w:r>
+        <w:t xml:space="preserve">1 x Interview Camera Operator</w:t>
+      </w:r>
+    </w:p>
+    <w:p>
+      <w:pPr>
+        <w:pStyle w:val="Compact"/>
+        <w:numPr>
+          <w:ilvl w:val="0"/>
+          <w:numId w:val="1015"/>
+        </w:numPr>
+      </w:pPr>
+      <w:r>
+        <w:t xml:space="preserve">1 x Interview Sound Recordist</w:t>
+      </w:r>
+    </w:p>
+    <w:p>
+      <w:pPr>
+        <w:pStyle w:val="FirstParagraph"/>
       </w:pPr>
       <w:r>
         <w:rPr>
@@ -1859,52 +1991,94 @@
         </w:rPr>
         <w:t xml:space="preserve">Post Production (Total: 10)</w:t>
       </w:r>
-      <w:r>
-        <w:t xml:space="preserve"> </w:t>
-      </w:r>
-      <w:r>
-        <w:t xml:space="preserve">- 2 x Lead Editors (one per 4 episodes)</w:t>
-      </w:r>
-      <w:r>
-        <w:t xml:space="preserve"> </w:t>
-      </w:r>
-      <w:r>
-        <w:t xml:space="preserve">- 2 x Assistant Editors</w:t>
-      </w:r>
-      <w:r>
-        <w:t xml:space="preserve"> </w:t>
-      </w:r>
-      <w:r>
-        <w:t xml:space="preserve">- 1 x Motion Graphics Designer (creates DealStage platform overlays and data visualizations)</w:t>
-      </w:r>
-      <w:r>
-        <w:t xml:space="preserve"> </w:t>
-      </w:r>
-      <w:r>
-        <w:t xml:space="preserve">- 1 x Colorist</w:t>
-      </w:r>
-      <w:r>
-        <w:t xml:space="preserve"> </w:t>
-      </w:r>
-      <w:r>
-        <w:t xml:space="preserve">- 1 x Sound Designer / Mixer</w:t>
-      </w:r>
-      <w:r>
-        <w:t xml:space="preserve"> </w:t>
-      </w:r>
-      <w:r>
-        <w:t xml:space="preserve">- 1 x Music Supervisor</w:t>
-      </w:r>
-      <w:r>
-        <w:t xml:space="preserve"> </w:t>
-      </w:r>
-      <w:r>
-        <w:t xml:space="preserve">- 2 x Post Production Assistants</w:t>
-      </w:r>
-    </w:p>
-    <w:p>
-      <w:pPr>
-        <w:pStyle w:val="BodyText"/>
+    </w:p>
+    <w:p>
+      <w:pPr>
+        <w:pStyle w:val="Compact"/>
+        <w:numPr>
+          <w:ilvl w:val="0"/>
+          <w:numId w:val="1016"/>
+        </w:numPr>
+      </w:pPr>
+      <w:r>
+        <w:t xml:space="preserve">2 x Lead Editors (one per 4 episodes)</w:t>
+      </w:r>
+    </w:p>
+    <w:p>
+      <w:pPr>
+        <w:pStyle w:val="Compact"/>
+        <w:numPr>
+          <w:ilvl w:val="0"/>
+          <w:numId w:val="1016"/>
+        </w:numPr>
+      </w:pPr>
+      <w:r>
+        <w:t xml:space="preserve">2 x Assistant Editors</w:t>
+      </w:r>
+    </w:p>
+    <w:p>
+      <w:pPr>
+        <w:pStyle w:val="Compact"/>
+        <w:numPr>
+          <w:ilvl w:val="0"/>
+          <w:numId w:val="1016"/>
+        </w:numPr>
+      </w:pPr>
+      <w:r>
+        <w:t xml:space="preserve">1 x Motion Graphics Designer (creates DealStage platform overlays and data visualizations)</w:t>
+      </w:r>
+    </w:p>
+    <w:p>
+      <w:pPr>
+        <w:pStyle w:val="Compact"/>
+        <w:numPr>
+          <w:ilvl w:val="0"/>
+          <w:numId w:val="1016"/>
+        </w:numPr>
+      </w:pPr>
+      <w:r>
+        <w:t xml:space="preserve">1 x Colorist</w:t>
+      </w:r>
+    </w:p>
+    <w:p>
+      <w:pPr>
+        <w:pStyle w:val="Compact"/>
+        <w:numPr>
+          <w:ilvl w:val="0"/>
+          <w:numId w:val="1016"/>
+        </w:numPr>
+      </w:pPr>
+      <w:r>
+        <w:t xml:space="preserve">1 x Sound Designer / Mixer</w:t>
+      </w:r>
+    </w:p>
+    <w:p>
+      <w:pPr>
+        <w:pStyle w:val="Compact"/>
+        <w:numPr>
+          <w:ilvl w:val="0"/>
+          <w:numId w:val="1016"/>
+        </w:numPr>
+      </w:pPr>
+      <w:r>
+        <w:t xml:space="preserve">1 x Music Supervisor</w:t>
+      </w:r>
+    </w:p>
+    <w:p>
+      <w:pPr>
+        <w:pStyle w:val="Compact"/>
+        <w:numPr>
+          <w:ilvl w:val="0"/>
+          <w:numId w:val="1016"/>
+        </w:numPr>
+      </w:pPr>
+      <w:r>
+        <w:t xml:space="preserve">2 x Post Production Assistants</w:t>
+      </w:r>
+    </w:p>
+    <w:p>
+      <w:pPr>
+        <w:pStyle w:val="FirstParagraph"/>
       </w:pPr>
       <w:r>
         <w:rPr>
@@ -1913,17 +2087,29 @@
         </w:rPr>
         <w:t xml:space="preserve">Digital and Social Extension Team (Total: 4)</w:t>
       </w:r>
-      <w:r>
-        <w:t xml:space="preserve"> </w:t>
-      </w:r>
-      <w:r>
-        <w:t xml:space="preserve">- 1 x Social Content Producer (cuts episode clips optimized for TikTok, Instagram Reels, LinkedIn)</w:t>
-      </w:r>
-      <w:r>
-        <w:t xml:space="preserve"> </w:t>
-      </w:r>
-      <w:r>
-        <w:t xml:space="preserve">- 1 x Digital Producer (manages supplemental content —</w:t>
+    </w:p>
+    <w:p>
+      <w:pPr>
+        <w:pStyle w:val="Compact"/>
+        <w:numPr>
+          <w:ilvl w:val="0"/>
+          <w:numId w:val="1017"/>
+        </w:numPr>
+      </w:pPr>
+      <w:r>
+        <w:t xml:space="preserve">1 x Social Content Producer (cuts episode clips optimized for TikTok, Instagram Reels, LinkedIn)</w:t>
+      </w:r>
+    </w:p>
+    <w:p>
+      <w:pPr>
+        <w:pStyle w:val="Compact"/>
+        <w:numPr>
+          <w:ilvl w:val="0"/>
+          <w:numId w:val="1017"/>
+        </w:numPr>
+      </w:pPr>
+      <w:r>
+        <w:t xml:space="preserve">1 x Digital Producer (manages supplemental content —</w:t>
       </w:r>
       <w:r>
         <w:t xml:space="preserve"> </w:t>
@@ -1937,22 +2123,34 @@
       <w:r>
         <w:t xml:space="preserve">on YouTube, episode extras)</w:t>
       </w:r>
-      <w:r>
-        <w:t xml:space="preserve"> </w:t>
-      </w:r>
-      <w:r>
-        <w:t xml:space="preserve">- 1 x Photographer (set stills for press and social)</w:t>
-      </w:r>
-      <w:r>
-        <w:t xml:space="preserve"> </w:t>
-      </w:r>
-      <w:r>
-        <w:t xml:space="preserve">- 1 x Social Media Coordinator</w:t>
-      </w:r>
-    </w:p>
-    <w:p>
-      <w:pPr>
-        <w:pStyle w:val="BodyText"/>
+    </w:p>
+    <w:p>
+      <w:pPr>
+        <w:pStyle w:val="Compact"/>
+        <w:numPr>
+          <w:ilvl w:val="0"/>
+          <w:numId w:val="1017"/>
+        </w:numPr>
+      </w:pPr>
+      <w:r>
+        <w:t xml:space="preserve">1 x Photographer (set stills for press and social)</w:t>
+      </w:r>
+    </w:p>
+    <w:p>
+      <w:pPr>
+        <w:pStyle w:val="Compact"/>
+        <w:numPr>
+          <w:ilvl w:val="0"/>
+          <w:numId w:val="1017"/>
+        </w:numPr>
+      </w:pPr>
+      <w:r>
+        <w:t xml:space="preserve">1 x Social Media Coordinator</w:t>
+      </w:r>
+    </w:p>
+    <w:p>
+      <w:pPr>
+        <w:pStyle w:val="FirstParagraph"/>
       </w:pPr>
       <w:r>
         <w:rPr>
@@ -1961,40 +2159,70 @@
         </w:rPr>
         <w:t xml:space="preserve">Business and Operations (Total: 5)</w:t>
       </w:r>
-      <w:r>
-        <w:t xml:space="preserve"> </w:t>
-      </w:r>
-      <w:r>
-        <w:t xml:space="preserve">- Production Accountant</w:t>
-      </w:r>
-      <w:r>
-        <w:t xml:space="preserve"> </w:t>
-      </w:r>
-      <w:r>
-        <w:t xml:space="preserve">- Legal / Business Affairs (ongoing)</w:t>
-      </w:r>
-      <w:r>
-        <w:t xml:space="preserve"> </w:t>
-      </w:r>
-      <w:r>
-        <w:t xml:space="preserve">- Talent Relations Manager (manages relationships with agents, their clients, and participating brands)</w:t>
-      </w:r>
-      <w:r>
-        <w:t xml:space="preserve"> </w:t>
-      </w:r>
-      <w:r>
-        <w:t xml:space="preserve">- Brand Integration Producer (coordinates brand partner appearances and product integration moments)</w:t>
-      </w:r>
-      <w:r>
-        <w:t xml:space="preserve"> </w:t>
-      </w:r>
-      <w:r>
-        <w:t xml:space="preserve">- Health and Safety Coordinator</w:t>
-      </w:r>
-    </w:p>
-    <w:p>
-      <w:pPr>
-        <w:pStyle w:val="BodyText"/>
+    </w:p>
+    <w:p>
+      <w:pPr>
+        <w:pStyle w:val="Compact"/>
+        <w:numPr>
+          <w:ilvl w:val="0"/>
+          <w:numId w:val="1018"/>
+        </w:numPr>
+      </w:pPr>
+      <w:r>
+        <w:t xml:space="preserve">Production Accountant</w:t>
+      </w:r>
+    </w:p>
+    <w:p>
+      <w:pPr>
+        <w:pStyle w:val="Compact"/>
+        <w:numPr>
+          <w:ilvl w:val="0"/>
+          <w:numId w:val="1018"/>
+        </w:numPr>
+      </w:pPr>
+      <w:r>
+        <w:t xml:space="preserve">Legal / Business Affairs (ongoing)</w:t>
+      </w:r>
+    </w:p>
+    <w:p>
+      <w:pPr>
+        <w:pStyle w:val="Compact"/>
+        <w:numPr>
+          <w:ilvl w:val="0"/>
+          <w:numId w:val="1018"/>
+        </w:numPr>
+      </w:pPr>
+      <w:r>
+        <w:t xml:space="preserve">Talent Relations Manager (manages relationships with agents, their clients, and participating brands)</w:t>
+      </w:r>
+    </w:p>
+    <w:p>
+      <w:pPr>
+        <w:pStyle w:val="Compact"/>
+        <w:numPr>
+          <w:ilvl w:val="0"/>
+          <w:numId w:val="1018"/>
+        </w:numPr>
+      </w:pPr>
+      <w:r>
+        <w:t xml:space="preserve">Brand Integration Producer (coordinates brand partner appearances and product integration moments)</w:t>
+      </w:r>
+    </w:p>
+    <w:p>
+      <w:pPr>
+        <w:pStyle w:val="Compact"/>
+        <w:numPr>
+          <w:ilvl w:val="0"/>
+          <w:numId w:val="1018"/>
+        </w:numPr>
+      </w:pPr>
+      <w:r>
+        <w:t xml:space="preserve">Health and Safety Coordinator</w:t>
+      </w:r>
+    </w:p>
+    <w:p>
+      <w:pPr>
+        <w:pStyle w:val="FirstParagraph"/>
       </w:pPr>
       <w:r>
         <w:rPr>
@@ -2102,7 +2330,7 @@
         <w:pStyle w:val="Compact"/>
         <w:numPr>
           <w:ilvl w:val="0"/>
-          <w:numId w:val="1011"/>
+          <w:numId w:val="1019"/>
         </w:numPr>
       </w:pPr>
       <w:r>
@@ -2120,7 +2348,7 @@
         <w:pStyle w:val="Compact"/>
         <w:numPr>
           <w:ilvl w:val="0"/>
-          <w:numId w:val="1011"/>
+          <w:numId w:val="1019"/>
         </w:numPr>
       </w:pPr>
       <w:r>
@@ -2138,7 +2366,7 @@
         <w:pStyle w:val="Compact"/>
         <w:numPr>
           <w:ilvl w:val="0"/>
-          <w:numId w:val="1011"/>
+          <w:numId w:val="1019"/>
         </w:numPr>
       </w:pPr>
       <w:r>
@@ -2168,7 +2396,7 @@
         <w:pStyle w:val="Compact"/>
         <w:numPr>
           <w:ilvl w:val="0"/>
-          <w:numId w:val="1012"/>
+          <w:numId w:val="1020"/>
         </w:numPr>
       </w:pPr>
       <w:r>
@@ -2180,7 +2408,7 @@
         <w:pStyle w:val="Compact"/>
         <w:numPr>
           <w:ilvl w:val="0"/>
-          <w:numId w:val="1012"/>
+          <w:numId w:val="1020"/>
         </w:numPr>
       </w:pPr>
       <w:r>
@@ -2192,7 +2420,7 @@
         <w:pStyle w:val="Compact"/>
         <w:numPr>
           <w:ilvl w:val="0"/>
-          <w:numId w:val="1012"/>
+          <w:numId w:val="1020"/>
         </w:numPr>
       </w:pPr>
       <w:r>
@@ -2204,7 +2432,7 @@
         <w:pStyle w:val="Compact"/>
         <w:numPr>
           <w:ilvl w:val="0"/>
-          <w:numId w:val="1012"/>
+          <w:numId w:val="1020"/>
         </w:numPr>
       </w:pPr>
       <w:r>
@@ -2395,8 +2623,8 @@
         <w:tblLook w:firstRow="1" w:lastRow="0" w:firstColumn="0" w:lastColumn="0" w:noHBand="0" w:noVBand="0" w:val="0020"/>
       </w:tblPr>
       <w:tblGrid>
-        <w:gridCol w:w="4950"/>
-        <w:gridCol w:w="2970"/>
+        <w:gridCol w:w="6336"/>
+        <w:gridCol w:w="1584"/>
       </w:tblGrid>
       <w:tr>
         <w:trPr>
@@ -2651,8 +2879,8 @@
         <w:tblLook w:firstRow="1" w:lastRow="0" w:firstColumn="0" w:lastColumn="0" w:noHBand="0" w:noVBand="0" w:val="0020"/>
       </w:tblPr>
       <w:tblGrid>
-        <w:gridCol w:w="2184"/>
-        <w:gridCol w:w="5735"/>
+        <w:gridCol w:w="6368"/>
+        <w:gridCol w:w="1551"/>
       </w:tblGrid>
       <w:tr>
         <w:trPr>
@@ -2880,7 +3108,7 @@
         <w:pStyle w:val="Compact"/>
         <w:numPr>
           <w:ilvl w:val="0"/>
-          <w:numId w:val="1013"/>
+          <w:numId w:val="1021"/>
         </w:numPr>
       </w:pPr>
       <w:r>
@@ -2892,7 +3120,7 @@
         <w:pStyle w:val="Compact"/>
         <w:numPr>
           <w:ilvl w:val="0"/>
-          <w:numId w:val="1013"/>
+          <w:numId w:val="1021"/>
         </w:numPr>
       </w:pPr>
       <w:r>
@@ -2904,7 +3132,7 @@
         <w:pStyle w:val="Compact"/>
         <w:numPr>
           <w:ilvl w:val="0"/>
-          <w:numId w:val="1013"/>
+          <w:numId w:val="1021"/>
         </w:numPr>
       </w:pPr>
       <w:r>
@@ -2922,7 +3150,7 @@
         <w:pStyle w:val="Compact"/>
         <w:numPr>
           <w:ilvl w:val="0"/>
-          <w:numId w:val="1013"/>
+          <w:numId w:val="1021"/>
         </w:numPr>
       </w:pPr>
       <w:r>
@@ -2934,7 +3162,7 @@
         <w:pStyle w:val="Compact"/>
         <w:numPr>
           <w:ilvl w:val="0"/>
-          <w:numId w:val="1013"/>
+          <w:numId w:val="1021"/>
         </w:numPr>
       </w:pPr>
       <w:r>
@@ -2946,7 +3174,7 @@
         <w:pStyle w:val="Compact"/>
         <w:numPr>
           <w:ilvl w:val="0"/>
-          <w:numId w:val="1013"/>
+          <w:numId w:val="1021"/>
         </w:numPr>
       </w:pPr>
       <w:r>
@@ -2958,7 +3186,7 @@
         <w:pStyle w:val="Compact"/>
         <w:numPr>
           <w:ilvl w:val="0"/>
-          <w:numId w:val="1013"/>
+          <w:numId w:val="1021"/>
         </w:numPr>
       </w:pPr>
       <w:r>
@@ -2990,8 +3218,8 @@
         <w:tblLook w:firstRow="1" w:lastRow="0" w:firstColumn="0" w:lastColumn="0" w:noHBand="0" w:noVBand="0" w:val="0020"/>
       </w:tblPr>
       <w:tblGrid>
-        <w:gridCol w:w="3080"/>
-        <w:gridCol w:w="4840"/>
+        <w:gridCol w:w="465"/>
+        <w:gridCol w:w="7454"/>
       </w:tblGrid>
       <w:tr>
         <w:trPr>
@@ -3238,8 +3466,8 @@
         <w:tblLook w:firstRow="1" w:lastRow="0" w:firstColumn="0" w:lastColumn="0" w:noHBand="0" w:noVBand="0" w:val="0020"/>
       </w:tblPr>
       <w:tblGrid>
-        <w:gridCol w:w="3261"/>
-        <w:gridCol w:w="4658"/>
+        <w:gridCol w:w="1663"/>
+        <w:gridCol w:w="6256"/>
       </w:tblGrid>
       <w:tr>
         <w:trPr>
@@ -3389,6 +3617,20 @@
         </w:tc>
       </w:tr>
     </w:tbl>
+    <w:p>
+      <w:r>
+        <w:pict>
+          <v:rect style="width:0;height:1.5pt" o:hralign="center" o:hrstd="t" o:hr="t"/>
+        </w:pict>
+      </w:r>
+    </w:p>
+    <w:p>
+      <w:r>
+        <w:pict>
+          <v:rect style="width:0;height:1.5pt" o:hralign="center" o:hrstd="t" o:hr="t"/>
+        </w:pict>
+      </w:r>
+    </w:p>
     <w:bookmarkEnd w:id="26"/>
     <w:bookmarkEnd w:id="27"/>
     <w:bookmarkStart w:id="44" w:name="X070b2fec977261f38aab8f5b58d67afd54ffe9c"/>
@@ -3506,7 +3748,7 @@
         <w:pStyle w:val="Compact"/>
         <w:numPr>
           <w:ilvl w:val="0"/>
-          <w:numId w:val="1014"/>
+          <w:numId w:val="1022"/>
         </w:numPr>
       </w:pPr>
       <w:r>
@@ -3518,7 +3760,7 @@
         <w:pStyle w:val="Compact"/>
         <w:numPr>
           <w:ilvl w:val="0"/>
-          <w:numId w:val="1014"/>
+          <w:numId w:val="1022"/>
         </w:numPr>
       </w:pPr>
       <w:r>
@@ -3530,7 +3772,7 @@
         <w:pStyle w:val="Compact"/>
         <w:numPr>
           <w:ilvl w:val="0"/>
-          <w:numId w:val="1014"/>
+          <w:numId w:val="1022"/>
         </w:numPr>
       </w:pPr>
       <w:r>
@@ -3542,7 +3784,7 @@
         <w:pStyle w:val="Compact"/>
         <w:numPr>
           <w:ilvl w:val="0"/>
-          <w:numId w:val="1014"/>
+          <w:numId w:val="1022"/>
         </w:numPr>
       </w:pPr>
       <w:r>
@@ -3554,7 +3796,7 @@
         <w:pStyle w:val="Compact"/>
         <w:numPr>
           <w:ilvl w:val="0"/>
-          <w:numId w:val="1014"/>
+          <w:numId w:val="1022"/>
         </w:numPr>
       </w:pPr>
       <w:r>
@@ -3877,7 +4119,7 @@
         <w:pStyle w:val="Compact"/>
         <w:numPr>
           <w:ilvl w:val="0"/>
-          <w:numId w:val="1015"/>
+          <w:numId w:val="1023"/>
         </w:numPr>
       </w:pPr>
       <w:r>
@@ -3889,7 +4131,7 @@
         <w:pStyle w:val="Compact"/>
         <w:numPr>
           <w:ilvl w:val="0"/>
-          <w:numId w:val="1015"/>
+          <w:numId w:val="1023"/>
         </w:numPr>
       </w:pPr>
       <w:r>
@@ -3901,7 +4143,7 @@
         <w:pStyle w:val="Compact"/>
         <w:numPr>
           <w:ilvl w:val="0"/>
-          <w:numId w:val="1015"/>
+          <w:numId w:val="1023"/>
         </w:numPr>
       </w:pPr>
       <w:r>
@@ -3913,7 +4155,7 @@
         <w:pStyle w:val="Compact"/>
         <w:numPr>
           <w:ilvl w:val="0"/>
-          <w:numId w:val="1015"/>
+          <w:numId w:val="1023"/>
         </w:numPr>
       </w:pPr>
       <w:r>
@@ -3925,7 +4167,7 @@
         <w:pStyle w:val="Compact"/>
         <w:numPr>
           <w:ilvl w:val="0"/>
-          <w:numId w:val="1015"/>
+          <w:numId w:val="1023"/>
         </w:numPr>
       </w:pPr>
       <w:r>
@@ -3937,7 +4179,7 @@
         <w:pStyle w:val="Compact"/>
         <w:numPr>
           <w:ilvl w:val="0"/>
-          <w:numId w:val="1015"/>
+          <w:numId w:val="1023"/>
         </w:numPr>
       </w:pPr>
       <w:r>
@@ -3949,7 +4191,7 @@
         <w:pStyle w:val="Compact"/>
         <w:numPr>
           <w:ilvl w:val="0"/>
-          <w:numId w:val="1015"/>
+          <w:numId w:val="1023"/>
         </w:numPr>
       </w:pPr>
       <w:r>
@@ -4026,7 +4268,7 @@
         <w:pStyle w:val="Compact"/>
         <w:numPr>
           <w:ilvl w:val="0"/>
-          <w:numId w:val="1016"/>
+          <w:numId w:val="1024"/>
         </w:numPr>
       </w:pPr>
       <w:r>
@@ -4038,7 +4280,7 @@
         <w:pStyle w:val="Compact"/>
         <w:numPr>
           <w:ilvl w:val="0"/>
-          <w:numId w:val="1016"/>
+          <w:numId w:val="1024"/>
         </w:numPr>
       </w:pPr>
       <w:r>
@@ -4050,7 +4292,7 @@
         <w:pStyle w:val="Compact"/>
         <w:numPr>
           <w:ilvl w:val="0"/>
-          <w:numId w:val="1016"/>
+          <w:numId w:val="1024"/>
         </w:numPr>
       </w:pPr>
       <w:r>
@@ -4062,7 +4304,7 @@
         <w:pStyle w:val="Compact"/>
         <w:numPr>
           <w:ilvl w:val="0"/>
-          <w:numId w:val="1016"/>
+          <w:numId w:val="1024"/>
         </w:numPr>
       </w:pPr>
       <w:r>
@@ -4074,7 +4316,7 @@
         <w:pStyle w:val="Compact"/>
         <w:numPr>
           <w:ilvl w:val="0"/>
-          <w:numId w:val="1016"/>
+          <w:numId w:val="1024"/>
         </w:numPr>
       </w:pPr>
       <w:r>
@@ -4086,7 +4328,7 @@
         <w:pStyle w:val="Compact"/>
         <w:numPr>
           <w:ilvl w:val="0"/>
-          <w:numId w:val="1016"/>
+          <w:numId w:val="1024"/>
         </w:numPr>
       </w:pPr>
       <w:r>
@@ -4098,7 +4340,7 @@
         <w:pStyle w:val="Compact"/>
         <w:numPr>
           <w:ilvl w:val="0"/>
-          <w:numId w:val="1016"/>
+          <w:numId w:val="1024"/>
         </w:numPr>
       </w:pPr>
       <w:r>
@@ -4110,7 +4352,7 @@
         <w:pStyle w:val="Compact"/>
         <w:numPr>
           <w:ilvl w:val="0"/>
-          <w:numId w:val="1016"/>
+          <w:numId w:val="1024"/>
         </w:numPr>
       </w:pPr>
       <w:r>
@@ -4176,7 +4418,7 @@
         <w:pStyle w:val="Compact"/>
         <w:numPr>
           <w:ilvl w:val="0"/>
-          <w:numId w:val="1017"/>
+          <w:numId w:val="1025"/>
         </w:numPr>
       </w:pPr>
       <w:r>
@@ -4188,7 +4430,7 @@
         <w:pStyle w:val="Compact"/>
         <w:numPr>
           <w:ilvl w:val="0"/>
-          <w:numId w:val="1017"/>
+          <w:numId w:val="1025"/>
         </w:numPr>
       </w:pPr>
       <w:r>
@@ -4200,7 +4442,7 @@
         <w:pStyle w:val="Compact"/>
         <w:numPr>
           <w:ilvl w:val="0"/>
-          <w:numId w:val="1017"/>
+          <w:numId w:val="1025"/>
         </w:numPr>
       </w:pPr>
       <w:r>
@@ -4212,7 +4454,7 @@
         <w:pStyle w:val="Compact"/>
         <w:numPr>
           <w:ilvl w:val="0"/>
-          <w:numId w:val="1017"/>
+          <w:numId w:val="1025"/>
         </w:numPr>
       </w:pPr>
       <w:r>
@@ -4278,7 +4520,7 @@
         <w:pStyle w:val="Compact"/>
         <w:numPr>
           <w:ilvl w:val="0"/>
-          <w:numId w:val="1018"/>
+          <w:numId w:val="1026"/>
         </w:numPr>
       </w:pPr>
       <w:r>
@@ -4290,7 +4532,7 @@
         <w:pStyle w:val="Compact"/>
         <w:numPr>
           <w:ilvl w:val="0"/>
-          <w:numId w:val="1018"/>
+          <w:numId w:val="1026"/>
         </w:numPr>
       </w:pPr>
       <w:r>
@@ -4302,7 +4544,7 @@
         <w:pStyle w:val="Compact"/>
         <w:numPr>
           <w:ilvl w:val="0"/>
-          <w:numId w:val="1018"/>
+          <w:numId w:val="1026"/>
         </w:numPr>
       </w:pPr>
       <w:r>
@@ -4314,7 +4556,7 @@
         <w:pStyle w:val="Compact"/>
         <w:numPr>
           <w:ilvl w:val="0"/>
-          <w:numId w:val="1018"/>
+          <w:numId w:val="1026"/>
         </w:numPr>
       </w:pPr>
       <w:r>
@@ -4551,7 +4793,7 @@
         <w:pStyle w:val="Compact"/>
         <w:numPr>
           <w:ilvl w:val="0"/>
-          <w:numId w:val="1019"/>
+          <w:numId w:val="1027"/>
         </w:numPr>
       </w:pPr>
       <w:r>
@@ -4563,7 +4805,7 @@
         <w:pStyle w:val="Compact"/>
         <w:numPr>
           <w:ilvl w:val="0"/>
-          <w:numId w:val="1019"/>
+          <w:numId w:val="1027"/>
         </w:numPr>
       </w:pPr>
       <w:r>
@@ -4575,7 +4817,7 @@
         <w:pStyle w:val="Compact"/>
         <w:numPr>
           <w:ilvl w:val="0"/>
-          <w:numId w:val="1019"/>
+          <w:numId w:val="1027"/>
         </w:numPr>
       </w:pPr>
       <w:r>
@@ -4857,40 +5099,70 @@
         </w:rPr>
         <w:t xml:space="preserve">Executive Level (Total: 5)</w:t>
       </w:r>
-      <w:r>
-        <w:t xml:space="preserve"> </w:t>
-      </w:r>
-      <w:r>
-        <w:t xml:space="preserve">- Showrunner / Executive Producer: must have both competition format and documentary experience; ideal candidate worked on The Apprentice, Shark Tank, or The Profit</w:t>
-      </w:r>
-      <w:r>
-        <w:t xml:space="preserve"> </w:t>
-      </w:r>
-      <w:r>
-        <w:t xml:space="preserve">- Executive Producer (DealStage): in-house executive managing platform integration accuracy and conversion optimization</w:t>
-      </w:r>
-      <w:r>
-        <w:t xml:space="preserve"> </w:t>
-      </w:r>
-      <w:r>
-        <w:t xml:space="preserve">- Executive Producer (Brand Relations): manages relationships with participating brands, coordinates their appearance agreements and on-screen representation</w:t>
-      </w:r>
-      <w:r>
-        <w:t xml:space="preserve"> </w:t>
-      </w:r>
-      <w:r>
-        <w:t xml:space="preserve">- Co-Executive Producer (Format / Story): develops the episode-by-episode format structure and ensures competitive integrity</w:t>
-      </w:r>
-      <w:r>
-        <w:t xml:space="preserve"> </w:t>
-      </w:r>
-      <w:r>
-        <w:t xml:space="preserve">- Network / Platform EP: appointed by distribution partner</w:t>
-      </w:r>
-    </w:p>
-    <w:p>
-      <w:pPr>
-        <w:pStyle w:val="BodyText"/>
+    </w:p>
+    <w:p>
+      <w:pPr>
+        <w:pStyle w:val="Compact"/>
+        <w:numPr>
+          <w:ilvl w:val="0"/>
+          <w:numId w:val="1028"/>
+        </w:numPr>
+      </w:pPr>
+      <w:r>
+        <w:t xml:space="preserve">Showrunner / Executive Producer: must have both competition format and documentary experience; ideal candidate worked on The Apprentice, Shark Tank, or The Profit</w:t>
+      </w:r>
+    </w:p>
+    <w:p>
+      <w:pPr>
+        <w:pStyle w:val="Compact"/>
+        <w:numPr>
+          <w:ilvl w:val="0"/>
+          <w:numId w:val="1028"/>
+        </w:numPr>
+      </w:pPr>
+      <w:r>
+        <w:t xml:space="preserve">Executive Producer (DealStage): in-house executive managing platform integration accuracy and conversion optimization</w:t>
+      </w:r>
+    </w:p>
+    <w:p>
+      <w:pPr>
+        <w:pStyle w:val="Compact"/>
+        <w:numPr>
+          <w:ilvl w:val="0"/>
+          <w:numId w:val="1028"/>
+        </w:numPr>
+      </w:pPr>
+      <w:r>
+        <w:t xml:space="preserve">Executive Producer (Brand Relations): manages relationships with participating brands, coordinates their appearance agreements and on-screen representation</w:t>
+      </w:r>
+    </w:p>
+    <w:p>
+      <w:pPr>
+        <w:pStyle w:val="Compact"/>
+        <w:numPr>
+          <w:ilvl w:val="0"/>
+          <w:numId w:val="1028"/>
+        </w:numPr>
+      </w:pPr>
+      <w:r>
+        <w:t xml:space="preserve">Co-Executive Producer (Format / Story): develops the episode-by-episode format structure and ensures competitive integrity</w:t>
+      </w:r>
+    </w:p>
+    <w:p>
+      <w:pPr>
+        <w:pStyle w:val="Compact"/>
+        <w:numPr>
+          <w:ilvl w:val="0"/>
+          <w:numId w:val="1028"/>
+        </w:numPr>
+      </w:pPr>
+      <w:r>
+        <w:t xml:space="preserve">Network / Platform EP: appointed by distribution partner</w:t>
+      </w:r>
+    </w:p>
+    <w:p>
+      <w:pPr>
+        <w:pStyle w:val="FirstParagraph"/>
       </w:pPr>
       <w:r>
         <w:rPr>
@@ -4899,64 +5171,118 @@
         </w:rPr>
         <w:t xml:space="preserve">Studio and Competition Production (Total: 12)</w:t>
       </w:r>
-      <w:r>
-        <w:t xml:space="preserve"> </w:t>
-      </w:r>
-      <w:r>
-        <w:t xml:space="preserve">- Line Producer: overall production logistics and budget</w:t>
-      </w:r>
-      <w:r>
-        <w:t xml:space="preserve"> </w:t>
-      </w:r>
-      <w:r>
-        <w:t xml:space="preserve">- Competition Producer: manages the draft mechanics, rules, and competitive integrity in real time</w:t>
-      </w:r>
-      <w:r>
-        <w:t xml:space="preserve"> </w:t>
-      </w:r>
-      <w:r>
-        <w:t xml:space="preserve">- 2 x Segment Producers: each responsible for specific episode segments (Data Session, Draft, Pitch, Talent Verdict, AI Verdict)</w:t>
-      </w:r>
-      <w:r>
-        <w:t xml:space="preserve"> </w:t>
-      </w:r>
-      <w:r>
-        <w:t xml:space="preserve">- Set Designer / Production Designer: designs the competition space — the draft board, the DealStage data displays, the pitch arena, the talent viewing room</w:t>
-      </w:r>
-      <w:r>
-        <w:t xml:space="preserve"> </w:t>
-      </w:r>
-      <w:r>
-        <w:t xml:space="preserve">- Art Director: executes the production designer’s vision</w:t>
-      </w:r>
-      <w:r>
-        <w:t xml:space="preserve"> </w:t>
-      </w:r>
-      <w:r>
-        <w:t xml:space="preserve">- Props and Graphics Coordinator: manages all DealStage on-screen displays and competition materials</w:t>
-      </w:r>
-      <w:r>
-        <w:t xml:space="preserve"> </w:t>
-      </w:r>
-      <w:r>
-        <w:t xml:space="preserve">- 2 x Associate Producers</w:t>
-      </w:r>
-      <w:r>
-        <w:t xml:space="preserve"> </w:t>
-      </w:r>
-      <w:r>
-        <w:t xml:space="preserve">- 2 x Production Coordinators</w:t>
-      </w:r>
-      <w:r>
-        <w:t xml:space="preserve"> </w:t>
-      </w:r>
-      <w:r>
-        <w:t xml:space="preserve">- 1 x Production Accountant</w:t>
-      </w:r>
-    </w:p>
-    <w:p>
-      <w:pPr>
-        <w:pStyle w:val="BodyText"/>
+    </w:p>
+    <w:p>
+      <w:pPr>
+        <w:pStyle w:val="Compact"/>
+        <w:numPr>
+          <w:ilvl w:val="0"/>
+          <w:numId w:val="1029"/>
+        </w:numPr>
+      </w:pPr>
+      <w:r>
+        <w:t xml:space="preserve">Line Producer: overall production logistics and budget</w:t>
+      </w:r>
+    </w:p>
+    <w:p>
+      <w:pPr>
+        <w:pStyle w:val="Compact"/>
+        <w:numPr>
+          <w:ilvl w:val="0"/>
+          <w:numId w:val="1029"/>
+        </w:numPr>
+      </w:pPr>
+      <w:r>
+        <w:t xml:space="preserve">Competition Producer: manages the draft mechanics, rules, and competitive integrity in real time</w:t>
+      </w:r>
+    </w:p>
+    <w:p>
+      <w:pPr>
+        <w:pStyle w:val="Compact"/>
+        <w:numPr>
+          <w:ilvl w:val="0"/>
+          <w:numId w:val="1029"/>
+        </w:numPr>
+      </w:pPr>
+      <w:r>
+        <w:t xml:space="preserve">2 x Segment Producers: each responsible for specific episode segments (Data Session, Draft, Pitch, Talent Verdict, AI Verdict)</w:t>
+      </w:r>
+    </w:p>
+    <w:p>
+      <w:pPr>
+        <w:pStyle w:val="Compact"/>
+        <w:numPr>
+          <w:ilvl w:val="0"/>
+          <w:numId w:val="1029"/>
+        </w:numPr>
+      </w:pPr>
+      <w:r>
+        <w:t xml:space="preserve">Set Designer / Production Designer: designs the competition space — the draft board, the DealStage data displays, the pitch arena, the talent viewing room</w:t>
+      </w:r>
+    </w:p>
+    <w:p>
+      <w:pPr>
+        <w:pStyle w:val="Compact"/>
+        <w:numPr>
+          <w:ilvl w:val="0"/>
+          <w:numId w:val="1029"/>
+        </w:numPr>
+      </w:pPr>
+      <w:r>
+        <w:t xml:space="preserve">Art Director: executes the production designer’s vision</w:t>
+      </w:r>
+    </w:p>
+    <w:p>
+      <w:pPr>
+        <w:pStyle w:val="Compact"/>
+        <w:numPr>
+          <w:ilvl w:val="0"/>
+          <w:numId w:val="1029"/>
+        </w:numPr>
+      </w:pPr>
+      <w:r>
+        <w:t xml:space="preserve">Props and Graphics Coordinator: manages all DealStage on-screen displays and competition materials</w:t>
+      </w:r>
+    </w:p>
+    <w:p>
+      <w:pPr>
+        <w:pStyle w:val="Compact"/>
+        <w:numPr>
+          <w:ilvl w:val="0"/>
+          <w:numId w:val="1029"/>
+        </w:numPr>
+      </w:pPr>
+      <w:r>
+        <w:t xml:space="preserve">2 x Associate Producers</w:t>
+      </w:r>
+    </w:p>
+    <w:p>
+      <w:pPr>
+        <w:pStyle w:val="Compact"/>
+        <w:numPr>
+          <w:ilvl w:val="0"/>
+          <w:numId w:val="1029"/>
+        </w:numPr>
+      </w:pPr>
+      <w:r>
+        <w:t xml:space="preserve">2 x Production Coordinators</w:t>
+      </w:r>
+    </w:p>
+    <w:p>
+      <w:pPr>
+        <w:pStyle w:val="Compact"/>
+        <w:numPr>
+          <w:ilvl w:val="0"/>
+          <w:numId w:val="1029"/>
+        </w:numPr>
+      </w:pPr>
+      <w:r>
+        <w:t xml:space="preserve">1 x Production Accountant</w:t>
+      </w:r>
+    </w:p>
+    <w:p>
+      <w:pPr>
+        <w:pStyle w:val="FirstParagraph"/>
       </w:pPr>
       <w:r>
         <w:rPr>
@@ -4965,52 +5291,94 @@
         </w:rPr>
         <w:t xml:space="preserve">Camera Department (Total: 12)</w:t>
       </w:r>
-      <w:r>
-        <w:t xml:space="preserve"> </w:t>
-      </w:r>
-      <w:r>
-        <w:t xml:space="preserve">- Director of Photography: visual language for the studio environment</w:t>
-      </w:r>
-      <w:r>
-        <w:t xml:space="preserve"> </w:t>
-      </w:r>
-      <w:r>
-        <w:t xml:space="preserve">- 4 x Studio Camera Operators: fixed positions covering the draft board, both brand teams, and wide establishing shots</w:t>
-      </w:r>
-      <w:r>
-        <w:t xml:space="preserve"> </w:t>
-      </w:r>
-      <w:r>
-        <w:t xml:space="preserve">- 2 x Handheld Camera Operators: follow the energy of dramatic moments</w:t>
-      </w:r>
-      <w:r>
-        <w:t xml:space="preserve"> </w:t>
-      </w:r>
-      <w:r>
-        <w:t xml:space="preserve">- 2 x Talent Room Camera Operators: dedicated coverage of the talent watching the brand pitches</w:t>
-      </w:r>
-      <w:r>
-        <w:t xml:space="preserve"> </w:t>
-      </w:r>
-      <w:r>
-        <w:t xml:space="preserve">- 1 x Jib/Crane Operator: for overhead draft board reveals and dramatic transition shots</w:t>
-      </w:r>
-      <w:r>
-        <w:t xml:space="preserve"> </w:t>
-      </w:r>
-      <w:r>
-        <w:t xml:space="preserve">- 1 x Playback Technician: manages DealStage data displays and real-time graphics</w:t>
-      </w:r>
-      <w:r>
-        <w:t xml:space="preserve"> </w:t>
-      </w:r>
-      <w:r>
-        <w:t xml:space="preserve">- 1 x Camera Coordinator</w:t>
-      </w:r>
-    </w:p>
-    <w:p>
-      <w:pPr>
-        <w:pStyle w:val="BodyText"/>
+    </w:p>
+    <w:p>
+      <w:pPr>
+        <w:pStyle w:val="Compact"/>
+        <w:numPr>
+          <w:ilvl w:val="0"/>
+          <w:numId w:val="1030"/>
+        </w:numPr>
+      </w:pPr>
+      <w:r>
+        <w:t xml:space="preserve">Director of Photography: visual language for the studio environment</w:t>
+      </w:r>
+    </w:p>
+    <w:p>
+      <w:pPr>
+        <w:pStyle w:val="Compact"/>
+        <w:numPr>
+          <w:ilvl w:val="0"/>
+          <w:numId w:val="1030"/>
+        </w:numPr>
+      </w:pPr>
+      <w:r>
+        <w:t xml:space="preserve">4 x Studio Camera Operators: fixed positions covering the draft board, both brand teams, and wide establishing shots</w:t>
+      </w:r>
+    </w:p>
+    <w:p>
+      <w:pPr>
+        <w:pStyle w:val="Compact"/>
+        <w:numPr>
+          <w:ilvl w:val="0"/>
+          <w:numId w:val="1030"/>
+        </w:numPr>
+      </w:pPr>
+      <w:r>
+        <w:t xml:space="preserve">2 x Handheld Camera Operators: follow the energy of dramatic moments</w:t>
+      </w:r>
+    </w:p>
+    <w:p>
+      <w:pPr>
+        <w:pStyle w:val="Compact"/>
+        <w:numPr>
+          <w:ilvl w:val="0"/>
+          <w:numId w:val="1030"/>
+        </w:numPr>
+      </w:pPr>
+      <w:r>
+        <w:t xml:space="preserve">2 x Talent Room Camera Operators: dedicated coverage of the talent watching the brand pitches</w:t>
+      </w:r>
+    </w:p>
+    <w:p>
+      <w:pPr>
+        <w:pStyle w:val="Compact"/>
+        <w:numPr>
+          <w:ilvl w:val="0"/>
+          <w:numId w:val="1030"/>
+        </w:numPr>
+      </w:pPr>
+      <w:r>
+        <w:t xml:space="preserve">1 x Jib/Crane Operator: for overhead draft board reveals and dramatic transition shots</w:t>
+      </w:r>
+    </w:p>
+    <w:p>
+      <w:pPr>
+        <w:pStyle w:val="Compact"/>
+        <w:numPr>
+          <w:ilvl w:val="0"/>
+          <w:numId w:val="1030"/>
+        </w:numPr>
+      </w:pPr>
+      <w:r>
+        <w:t xml:space="preserve">1 x Playback Technician: manages DealStage data displays and real-time graphics</w:t>
+      </w:r>
+    </w:p>
+    <w:p>
+      <w:pPr>
+        <w:pStyle w:val="Compact"/>
+        <w:numPr>
+          <w:ilvl w:val="0"/>
+          <w:numId w:val="1030"/>
+        </w:numPr>
+      </w:pPr>
+      <w:r>
+        <w:t xml:space="preserve">1 x Camera Coordinator</w:t>
+      </w:r>
+    </w:p>
+    <w:p>
+      <w:pPr>
+        <w:pStyle w:val="FirstParagraph"/>
       </w:pPr>
       <w:r>
         <w:rPr>
@@ -5019,28 +5387,46 @@
         </w:rPr>
         <w:t xml:space="preserve">Sound Department (Total: 6)</w:t>
       </w:r>
-      <w:r>
-        <w:t xml:space="preserve"> </w:t>
-      </w:r>
-      <w:r>
-        <w:t xml:space="preserve">- Sound Supervisor</w:t>
-      </w:r>
-      <w:r>
-        <w:t xml:space="preserve"> </w:t>
-      </w:r>
-      <w:r>
-        <w:t xml:space="preserve">- 2 x Boom Operators</w:t>
-      </w:r>
-      <w:r>
-        <w:t xml:space="preserve"> </w:t>
-      </w:r>
-      <w:r>
-        <w:t xml:space="preserve">- 3 x Radio Mic Technicians (wiring brand team members and talent for clear audio throughout)</w:t>
-      </w:r>
-    </w:p>
-    <w:p>
-      <w:pPr>
-        <w:pStyle w:val="BodyText"/>
+    </w:p>
+    <w:p>
+      <w:pPr>
+        <w:pStyle w:val="Compact"/>
+        <w:numPr>
+          <w:ilvl w:val="0"/>
+          <w:numId w:val="1031"/>
+        </w:numPr>
+      </w:pPr>
+      <w:r>
+        <w:t xml:space="preserve">Sound Supervisor</w:t>
+      </w:r>
+    </w:p>
+    <w:p>
+      <w:pPr>
+        <w:pStyle w:val="Compact"/>
+        <w:numPr>
+          <w:ilvl w:val="0"/>
+          <w:numId w:val="1031"/>
+        </w:numPr>
+      </w:pPr>
+      <w:r>
+        <w:t xml:space="preserve">2 x Boom Operators</w:t>
+      </w:r>
+    </w:p>
+    <w:p>
+      <w:pPr>
+        <w:pStyle w:val="Compact"/>
+        <w:numPr>
+          <w:ilvl w:val="0"/>
+          <w:numId w:val="1031"/>
+        </w:numPr>
+      </w:pPr>
+      <w:r>
+        <w:t xml:space="preserve">3 x Radio Mic Technicians (wiring brand team members and talent for clear audio throughout)</w:t>
+      </w:r>
+    </w:p>
+    <w:p>
+      <w:pPr>
+        <w:pStyle w:val="FirstParagraph"/>
       </w:pPr>
       <w:r>
         <w:rPr>
@@ -5049,34 +5435,58 @@
         </w:rPr>
         <w:t xml:space="preserve">Host and Talent Management (Total: 4)</w:t>
       </w:r>
-      <w:r>
-        <w:t xml:space="preserve"> </w:t>
-      </w:r>
-      <w:r>
-        <w:t xml:space="preserve">- Host (celebrity business figure or respected industry insider — see casting notes below)</w:t>
-      </w:r>
-      <w:r>
-        <w:t xml:space="preserve"> </w:t>
-      </w:r>
-      <w:r>
-        <w:t xml:space="preserve">- Talent Wrangler (manages the 10 talent participants per episode)</w:t>
-      </w:r>
-      <w:r>
-        <w:t xml:space="preserve"> </w:t>
-      </w:r>
-      <w:r>
-        <w:t xml:space="preserve">- Brand Team Liaison (manages both competing brand teams from arrival to departure)</w:t>
-      </w:r>
-      <w:r>
-        <w:t xml:space="preserve"> </w:t>
-      </w:r>
-      <w:r>
-        <w:t xml:space="preserve">- Green Room Coordinator</w:t>
-      </w:r>
-    </w:p>
-    <w:p>
-      <w:pPr>
-        <w:pStyle w:val="BodyText"/>
+    </w:p>
+    <w:p>
+      <w:pPr>
+        <w:pStyle w:val="Compact"/>
+        <w:numPr>
+          <w:ilvl w:val="0"/>
+          <w:numId w:val="1032"/>
+        </w:numPr>
+      </w:pPr>
+      <w:r>
+        <w:t xml:space="preserve">Host (celebrity business figure or respected industry insider — see casting notes below)</w:t>
+      </w:r>
+    </w:p>
+    <w:p>
+      <w:pPr>
+        <w:pStyle w:val="Compact"/>
+        <w:numPr>
+          <w:ilvl w:val="0"/>
+          <w:numId w:val="1032"/>
+        </w:numPr>
+      </w:pPr>
+      <w:r>
+        <w:t xml:space="preserve">Talent Wrangler (manages the 10 talent participants per episode)</w:t>
+      </w:r>
+    </w:p>
+    <w:p>
+      <w:pPr>
+        <w:pStyle w:val="Compact"/>
+        <w:numPr>
+          <w:ilvl w:val="0"/>
+          <w:numId w:val="1032"/>
+        </w:numPr>
+      </w:pPr>
+      <w:r>
+        <w:t xml:space="preserve">Brand Team Liaison (manages both competing brand teams from arrival to departure)</w:t>
+      </w:r>
+    </w:p>
+    <w:p>
+      <w:pPr>
+        <w:pStyle w:val="Compact"/>
+        <w:numPr>
+          <w:ilvl w:val="0"/>
+          <w:numId w:val="1032"/>
+        </w:numPr>
+      </w:pPr>
+      <w:r>
+        <w:t xml:space="preserve">Green Room Coordinator</w:t>
+      </w:r>
+    </w:p>
+    <w:p>
+      <w:pPr>
+        <w:pStyle w:val="FirstParagraph"/>
       </w:pPr>
       <w:r>
         <w:rPr>
@@ -5085,52 +5495,94 @@
         </w:rPr>
         <w:t xml:space="preserve">Post Production (Total: 10)</w:t>
       </w:r>
-      <w:r>
-        <w:t xml:space="preserve"> </w:t>
-      </w:r>
-      <w:r>
-        <w:t xml:space="preserve">- 2 x Lead Editors</w:t>
-      </w:r>
-      <w:r>
-        <w:t xml:space="preserve"> </w:t>
-      </w:r>
-      <w:r>
-        <w:t xml:space="preserve">- 2 x Assistant Editors</w:t>
-      </w:r>
-      <w:r>
-        <w:t xml:space="preserve"> </w:t>
-      </w:r>
-      <w:r>
-        <w:t xml:space="preserve">- 1 x Motion Graphics Designer (DealStage displays, score graphics, data visualizations)</w:t>
-      </w:r>
-      <w:r>
-        <w:t xml:space="preserve"> </w:t>
-      </w:r>
-      <w:r>
-        <w:t xml:space="preserve">- 1 x Colorist</w:t>
-      </w:r>
-      <w:r>
-        <w:t xml:space="preserve"> </w:t>
-      </w:r>
-      <w:r>
-        <w:t xml:space="preserve">- 1 x Sound Designer</w:t>
-      </w:r>
-      <w:r>
-        <w:t xml:space="preserve"> </w:t>
-      </w:r>
-      <w:r>
-        <w:t xml:space="preserve">- 1 x Music Supervisor</w:t>
-      </w:r>
-      <w:r>
-        <w:t xml:space="preserve"> </w:t>
-      </w:r>
-      <w:r>
-        <w:t xml:space="preserve">- 2 x Post Production Assistants</w:t>
-      </w:r>
-    </w:p>
-    <w:p>
-      <w:pPr>
-        <w:pStyle w:val="BodyText"/>
+    </w:p>
+    <w:p>
+      <w:pPr>
+        <w:pStyle w:val="Compact"/>
+        <w:numPr>
+          <w:ilvl w:val="0"/>
+          <w:numId w:val="1033"/>
+        </w:numPr>
+      </w:pPr>
+      <w:r>
+        <w:t xml:space="preserve">2 x Lead Editors</w:t>
+      </w:r>
+    </w:p>
+    <w:p>
+      <w:pPr>
+        <w:pStyle w:val="Compact"/>
+        <w:numPr>
+          <w:ilvl w:val="0"/>
+          <w:numId w:val="1033"/>
+        </w:numPr>
+      </w:pPr>
+      <w:r>
+        <w:t xml:space="preserve">2 x Assistant Editors</w:t>
+      </w:r>
+    </w:p>
+    <w:p>
+      <w:pPr>
+        <w:pStyle w:val="Compact"/>
+        <w:numPr>
+          <w:ilvl w:val="0"/>
+          <w:numId w:val="1033"/>
+        </w:numPr>
+      </w:pPr>
+      <w:r>
+        <w:t xml:space="preserve">1 x Motion Graphics Designer (DealStage displays, score graphics, data visualizations)</w:t>
+      </w:r>
+    </w:p>
+    <w:p>
+      <w:pPr>
+        <w:pStyle w:val="Compact"/>
+        <w:numPr>
+          <w:ilvl w:val="0"/>
+          <w:numId w:val="1033"/>
+        </w:numPr>
+      </w:pPr>
+      <w:r>
+        <w:t xml:space="preserve">1 x Colorist</w:t>
+      </w:r>
+    </w:p>
+    <w:p>
+      <w:pPr>
+        <w:pStyle w:val="Compact"/>
+        <w:numPr>
+          <w:ilvl w:val="0"/>
+          <w:numId w:val="1033"/>
+        </w:numPr>
+      </w:pPr>
+      <w:r>
+        <w:t xml:space="preserve">1 x Sound Designer</w:t>
+      </w:r>
+    </w:p>
+    <w:p>
+      <w:pPr>
+        <w:pStyle w:val="Compact"/>
+        <w:numPr>
+          <w:ilvl w:val="0"/>
+          <w:numId w:val="1033"/>
+        </w:numPr>
+      </w:pPr>
+      <w:r>
+        <w:t xml:space="preserve">1 x Music Supervisor</w:t>
+      </w:r>
+    </w:p>
+    <w:p>
+      <w:pPr>
+        <w:pStyle w:val="Compact"/>
+        <w:numPr>
+          <w:ilvl w:val="0"/>
+          <w:numId w:val="1033"/>
+        </w:numPr>
+      </w:pPr>
+      <w:r>
+        <w:t xml:space="preserve">2 x Post Production Assistants</w:t>
+      </w:r>
+    </w:p>
+    <w:p>
+      <w:pPr>
+        <w:pStyle w:val="FirstParagraph"/>
       </w:pPr>
       <w:r>
         <w:rPr>
@@ -5139,17 +5591,29 @@
         </w:rPr>
         <w:t xml:space="preserve">Digital and Social Extension (Total: 5)</w:t>
       </w:r>
-      <w:r>
-        <w:t xml:space="preserve"> </w:t>
-      </w:r>
-      <w:r>
-        <w:t xml:space="preserve">- Social Content Producer</w:t>
-      </w:r>
-      <w:r>
-        <w:t xml:space="preserve"> </w:t>
-      </w:r>
-      <w:r>
-        <w:t xml:space="preserve">- Digital Producer (manages</w:t>
+    </w:p>
+    <w:p>
+      <w:pPr>
+        <w:pStyle w:val="Compact"/>
+        <w:numPr>
+          <w:ilvl w:val="0"/>
+          <w:numId w:val="1034"/>
+        </w:numPr>
+      </w:pPr>
+      <w:r>
+        <w:t xml:space="preserve">Social Content Producer</w:t>
+      </w:r>
+    </w:p>
+    <w:p>
+      <w:pPr>
+        <w:pStyle w:val="Compact"/>
+        <w:numPr>
+          <w:ilvl w:val="0"/>
+          <w:numId w:val="1034"/>
+        </w:numPr>
+      </w:pPr>
+      <w:r>
+        <w:t xml:space="preserve">Digital Producer (manages</w:t>
       </w:r>
       <w:r>
         <w:t xml:space="preserve"> </w:t>
@@ -5163,22 +5627,34 @@
       <w:r>
         <w:t xml:space="preserve">companion feature)</w:t>
       </w:r>
-      <w:r>
-        <w:t xml:space="preserve"> </w:t>
-      </w:r>
-      <w:r>
-        <w:t xml:space="preserve">- 2 x Social Media Coordinators (real-time social during each episode — live-tweeting the draft, managing audience predictions)</w:t>
-      </w:r>
-      <w:r>
-        <w:t xml:space="preserve"> </w:t>
-      </w:r>
-      <w:r>
-        <w:t xml:space="preserve">- Photographer</w:t>
-      </w:r>
-    </w:p>
-    <w:p>
-      <w:pPr>
-        <w:pStyle w:val="BodyText"/>
+    </w:p>
+    <w:p>
+      <w:pPr>
+        <w:pStyle w:val="Compact"/>
+        <w:numPr>
+          <w:ilvl w:val="0"/>
+          <w:numId w:val="1034"/>
+        </w:numPr>
+      </w:pPr>
+      <w:r>
+        <w:t xml:space="preserve">2 x Social Media Coordinators (real-time social during each episode — live-tweeting the draft, managing audience predictions)</w:t>
+      </w:r>
+    </w:p>
+    <w:p>
+      <w:pPr>
+        <w:pStyle w:val="Compact"/>
+        <w:numPr>
+          <w:ilvl w:val="0"/>
+          <w:numId w:val="1034"/>
+        </w:numPr>
+      </w:pPr>
+      <w:r>
+        <w:t xml:space="preserve">Photographer</w:t>
+      </w:r>
+    </w:p>
+    <w:p>
+      <w:pPr>
+        <w:pStyle w:val="FirstParagraph"/>
       </w:pPr>
       <w:r>
         <w:rPr>
@@ -5187,28 +5663,46 @@
         </w:rPr>
         <w:t xml:space="preserve">Legal and Compliance (Total: 3)</w:t>
       </w:r>
-      <w:r>
-        <w:t xml:space="preserve"> </w:t>
-      </w:r>
-      <w:r>
-        <w:t xml:space="preserve">- Legal Affairs (ongoing per episode — deal commitments made on screen require real legal oversight)</w:t>
-      </w:r>
-      <w:r>
-        <w:t xml:space="preserve"> </w:t>
-      </w:r>
-      <w:r>
-        <w:t xml:space="preserve">- Standards and Practices Coordinator (network compliance)</w:t>
-      </w:r>
-      <w:r>
-        <w:t xml:space="preserve"> </w:t>
-      </w:r>
-      <w:r>
-        <w:t xml:space="preserve">- Contract Administrator (manages the real deal paperwork generated each episode)</w:t>
-      </w:r>
-    </w:p>
-    <w:p>
-      <w:pPr>
-        <w:pStyle w:val="BodyText"/>
+    </w:p>
+    <w:p>
+      <w:pPr>
+        <w:pStyle w:val="Compact"/>
+        <w:numPr>
+          <w:ilvl w:val="0"/>
+          <w:numId w:val="1035"/>
+        </w:numPr>
+      </w:pPr>
+      <w:r>
+        <w:t xml:space="preserve">Legal Affairs (ongoing per episode — deal commitments made on screen require real legal oversight)</w:t>
+      </w:r>
+    </w:p>
+    <w:p>
+      <w:pPr>
+        <w:pStyle w:val="Compact"/>
+        <w:numPr>
+          <w:ilvl w:val="0"/>
+          <w:numId w:val="1035"/>
+        </w:numPr>
+      </w:pPr>
+      <w:r>
+        <w:t xml:space="preserve">Standards and Practices Coordinator (network compliance)</w:t>
+      </w:r>
+    </w:p>
+    <w:p>
+      <w:pPr>
+        <w:pStyle w:val="Compact"/>
+        <w:numPr>
+          <w:ilvl w:val="0"/>
+          <w:numId w:val="1035"/>
+        </w:numPr>
+      </w:pPr>
+      <w:r>
+        <w:t xml:space="preserve">Contract Administrator (manages the real deal paperwork generated each episode)</w:t>
+      </w:r>
+    </w:p>
+    <w:p>
+      <w:pPr>
+        <w:pStyle w:val="FirstParagraph"/>
       </w:pPr>
       <w:r>
         <w:rPr>
@@ -5251,7 +5745,7 @@
         <w:pStyle w:val="Compact"/>
         <w:numPr>
           <w:ilvl w:val="0"/>
-          <w:numId w:val="1020"/>
+          <w:numId w:val="1036"/>
         </w:numPr>
       </w:pPr>
       <w:r>
@@ -5263,7 +5757,7 @@
         <w:pStyle w:val="Compact"/>
         <w:numPr>
           <w:ilvl w:val="0"/>
-          <w:numId w:val="1020"/>
+          <w:numId w:val="1036"/>
         </w:numPr>
       </w:pPr>
       <w:r>
@@ -5275,7 +5769,7 @@
         <w:pStyle w:val="Compact"/>
         <w:numPr>
           <w:ilvl w:val="0"/>
-          <w:numId w:val="1020"/>
+          <w:numId w:val="1036"/>
         </w:numPr>
       </w:pPr>
       <w:r>
@@ -5287,7 +5781,7 @@
         <w:pStyle w:val="Compact"/>
         <w:numPr>
           <w:ilvl w:val="0"/>
-          <w:numId w:val="1020"/>
+          <w:numId w:val="1036"/>
         </w:numPr>
       </w:pPr>
       <w:r>
@@ -5299,7 +5793,7 @@
         <w:pStyle w:val="Compact"/>
         <w:numPr>
           <w:ilvl w:val="0"/>
-          <w:numId w:val="1020"/>
+          <w:numId w:val="1036"/>
         </w:numPr>
       </w:pPr>
       <w:r>
@@ -5388,7 +5882,7 @@
         <w:pStyle w:val="Compact"/>
         <w:numPr>
           <w:ilvl w:val="0"/>
-          <w:numId w:val="1021"/>
+          <w:numId w:val="1037"/>
         </w:numPr>
       </w:pPr>
       <w:r>
@@ -5406,7 +5900,7 @@
         <w:pStyle w:val="Compact"/>
         <w:numPr>
           <w:ilvl w:val="0"/>
-          <w:numId w:val="1021"/>
+          <w:numId w:val="1037"/>
         </w:numPr>
       </w:pPr>
       <w:r>
@@ -5424,7 +5918,7 @@
         <w:pStyle w:val="Compact"/>
         <w:numPr>
           <w:ilvl w:val="0"/>
-          <w:numId w:val="1021"/>
+          <w:numId w:val="1037"/>
         </w:numPr>
       </w:pPr>
       <w:r>
@@ -5490,7 +5984,7 @@
         <w:pStyle w:val="Compact"/>
         <w:numPr>
           <w:ilvl w:val="0"/>
-          <w:numId w:val="1022"/>
+          <w:numId w:val="1038"/>
         </w:numPr>
       </w:pPr>
       <w:r>
@@ -5502,7 +5996,7 @@
         <w:pStyle w:val="Compact"/>
         <w:numPr>
           <w:ilvl w:val="0"/>
-          <w:numId w:val="1022"/>
+          <w:numId w:val="1038"/>
         </w:numPr>
       </w:pPr>
       <w:r>
@@ -5526,7 +6020,7 @@
         <w:pStyle w:val="Compact"/>
         <w:numPr>
           <w:ilvl w:val="0"/>
-          <w:numId w:val="1022"/>
+          <w:numId w:val="1038"/>
         </w:numPr>
       </w:pPr>
       <w:r>
@@ -5538,7 +6032,7 @@
         <w:pStyle w:val="Compact"/>
         <w:numPr>
           <w:ilvl w:val="0"/>
-          <w:numId w:val="1022"/>
+          <w:numId w:val="1038"/>
         </w:numPr>
       </w:pPr>
       <w:r>
@@ -5757,8 +6251,8 @@
         <w:tblLook w:firstRow="1" w:lastRow="0" w:firstColumn="0" w:lastColumn="0" w:noHBand="0" w:noVBand="0" w:val="0020"/>
       </w:tblPr>
       <w:tblGrid>
-        <w:gridCol w:w="4950"/>
-        <w:gridCol w:w="2970"/>
+        <w:gridCol w:w="6877"/>
+        <w:gridCol w:w="1042"/>
       </w:tblGrid>
       <w:tr>
         <w:trPr>
@@ -6021,8 +6515,8 @@
         <w:tblLook w:firstRow="1" w:lastRow="0" w:firstColumn="0" w:lastColumn="0" w:noHBand="0" w:noVBand="0" w:val="0020"/>
       </w:tblPr>
       <w:tblGrid>
-        <w:gridCol w:w="2184"/>
-        <w:gridCol w:w="5735"/>
+        <w:gridCol w:w="6444"/>
+        <w:gridCol w:w="1475"/>
       </w:tblGrid>
       <w:tr>
         <w:trPr>
@@ -6304,7 +6798,7 @@
         <w:pStyle w:val="Compact"/>
         <w:numPr>
           <w:ilvl w:val="0"/>
-          <w:numId w:val="1023"/>
+          <w:numId w:val="1039"/>
         </w:numPr>
       </w:pPr>
       <w:r>
@@ -6316,7 +6810,7 @@
         <w:pStyle w:val="Compact"/>
         <w:numPr>
           <w:ilvl w:val="0"/>
-          <w:numId w:val="1023"/>
+          <w:numId w:val="1039"/>
         </w:numPr>
       </w:pPr>
       <w:r>
@@ -6334,7 +6828,7 @@
         <w:pStyle w:val="Compact"/>
         <w:numPr>
           <w:ilvl w:val="0"/>
-          <w:numId w:val="1023"/>
+          <w:numId w:val="1039"/>
         </w:numPr>
       </w:pPr>
       <w:r>
@@ -6346,7 +6840,7 @@
         <w:pStyle w:val="Compact"/>
         <w:numPr>
           <w:ilvl w:val="0"/>
-          <w:numId w:val="1023"/>
+          <w:numId w:val="1039"/>
         </w:numPr>
       </w:pPr>
       <w:r>
@@ -6370,7 +6864,7 @@
         <w:pStyle w:val="Compact"/>
         <w:numPr>
           <w:ilvl w:val="0"/>
-          <w:numId w:val="1023"/>
+          <w:numId w:val="1039"/>
         </w:numPr>
       </w:pPr>
       <w:r>
@@ -6382,7 +6876,7 @@
         <w:pStyle w:val="Compact"/>
         <w:numPr>
           <w:ilvl w:val="0"/>
-          <w:numId w:val="1023"/>
+          <w:numId w:val="1039"/>
         </w:numPr>
       </w:pPr>
       <w:r>
@@ -6394,7 +6888,7 @@
         <w:pStyle w:val="Compact"/>
         <w:numPr>
           <w:ilvl w:val="0"/>
-          <w:numId w:val="1023"/>
+          <w:numId w:val="1039"/>
         </w:numPr>
       </w:pPr>
       <w:r>
@@ -6438,8 +6932,8 @@
         <w:tblLook w:firstRow="1" w:lastRow="0" w:firstColumn="0" w:lastColumn="0" w:noHBand="0" w:noVBand="0" w:val="0020"/>
       </w:tblPr>
       <w:tblGrid>
-        <w:gridCol w:w="3080"/>
-        <w:gridCol w:w="4840"/>
+        <w:gridCol w:w="450"/>
+        <w:gridCol w:w="7470"/>
       </w:tblGrid>
       <w:tr>
         <w:trPr>
@@ -6734,8 +7228,8 @@
         <w:tblLook w:firstRow="1" w:lastRow="0" w:firstColumn="0" w:lastColumn="0" w:noHBand="0" w:noVBand="0" w:val="0020"/>
       </w:tblPr>
       <w:tblGrid>
-        <w:gridCol w:w="3261"/>
-        <w:gridCol w:w="4658"/>
+        <w:gridCol w:w="1543"/>
+        <w:gridCol w:w="6376"/>
       </w:tblGrid>
       <w:tr>
         <w:trPr>
@@ -7064,7 +7558,7 @@
         <w:pStyle w:val="Compact"/>
         <w:numPr>
           <w:ilvl w:val="0"/>
-          <w:numId w:val="1024"/>
+          <w:numId w:val="1040"/>
         </w:numPr>
       </w:pPr>
       <w:r>
@@ -7076,7 +7570,7 @@
         <w:pStyle w:val="Compact"/>
         <w:numPr>
           <w:ilvl w:val="0"/>
-          <w:numId w:val="1024"/>
+          <w:numId w:val="1040"/>
         </w:numPr>
       </w:pPr>
       <w:r>
@@ -7088,7 +7582,7 @@
         <w:pStyle w:val="Compact"/>
         <w:numPr>
           <w:ilvl w:val="0"/>
-          <w:numId w:val="1024"/>
+          <w:numId w:val="1040"/>
         </w:numPr>
       </w:pPr>
       <w:r>
@@ -7126,7 +7620,7 @@
         <w:pStyle w:val="Compact"/>
         <w:numPr>
           <w:ilvl w:val="0"/>
-          <w:numId w:val="1025"/>
+          <w:numId w:val="1041"/>
         </w:numPr>
       </w:pPr>
       <w:r>
@@ -7138,7 +7632,7 @@
         <w:pStyle w:val="Compact"/>
         <w:numPr>
           <w:ilvl w:val="0"/>
-          <w:numId w:val="1025"/>
+          <w:numId w:val="1041"/>
         </w:numPr>
       </w:pPr>
       <w:r>
@@ -7150,7 +7644,7 @@
         <w:pStyle w:val="Compact"/>
         <w:numPr>
           <w:ilvl w:val="0"/>
-          <w:numId w:val="1025"/>
+          <w:numId w:val="1041"/>
         </w:numPr>
       </w:pPr>
       <w:r>
@@ -7162,7 +7656,7 @@
         <w:pStyle w:val="Compact"/>
         <w:numPr>
           <w:ilvl w:val="0"/>
-          <w:numId w:val="1025"/>
+          <w:numId w:val="1041"/>
         </w:numPr>
       </w:pPr>
       <w:r>
@@ -7176,39 +7670,63 @@
       <w:r>
         <w:t xml:space="preserve">Projected combined media empire revenue (Year 3, all four pillars active):</w:t>
       </w:r>
-      <w:r>
-        <w:t xml:space="preserve"> </w:t>
-      </w:r>
-      <w:r>
-        <w:t xml:space="preserve">- Television licensing and brand integration: $75M-$150M</w:t>
-      </w:r>
-      <w:r>
-        <w:t xml:space="preserve"> </w:t>
-      </w:r>
-      <w:r>
-        <w:t xml:space="preserve">- DealStage platform user acquisition value: $60M-$120M</w:t>
-      </w:r>
-      <w:r>
-        <w:t xml:space="preserve"> </w:t>
-      </w:r>
-      <w:r>
-        <w:t xml:space="preserve">- Format licensing and international: $10M-$25M</w:t>
-      </w:r>
-      <w:r>
-        <w:t xml:space="preserve"> </w:t>
-      </w:r>
-      <w:r>
-        <w:t xml:space="preserve">- Podcast and YouTube: $5M-$10M</w:t>
-      </w:r>
-      <w:r>
-        <w:t xml:space="preserve"> </w:t>
-      </w:r>
-      <w:r>
-        <w:t xml:space="preserve">-</w:t>
-      </w:r>
-      <w:r>
-        <w:t xml:space="preserve"> </w:t>
-      </w:r>
+    </w:p>
+    <w:p>
+      <w:pPr>
+        <w:pStyle w:val="Compact"/>
+        <w:numPr>
+          <w:ilvl w:val="0"/>
+          <w:numId w:val="1042"/>
+        </w:numPr>
+      </w:pPr>
+      <w:r>
+        <w:t xml:space="preserve">Television licensing and brand integration: $75M-$150M</w:t>
+      </w:r>
+    </w:p>
+    <w:p>
+      <w:pPr>
+        <w:pStyle w:val="Compact"/>
+        <w:numPr>
+          <w:ilvl w:val="0"/>
+          <w:numId w:val="1042"/>
+        </w:numPr>
+      </w:pPr>
+      <w:r>
+        <w:t xml:space="preserve">DealStage platform user acquisition value: $60M-$120M</w:t>
+      </w:r>
+    </w:p>
+    <w:p>
+      <w:pPr>
+        <w:pStyle w:val="Compact"/>
+        <w:numPr>
+          <w:ilvl w:val="0"/>
+          <w:numId w:val="1042"/>
+        </w:numPr>
+      </w:pPr>
+      <w:r>
+        <w:t xml:space="preserve">Format licensing and international: $10M-$25M</w:t>
+      </w:r>
+    </w:p>
+    <w:p>
+      <w:pPr>
+        <w:pStyle w:val="Compact"/>
+        <w:numPr>
+          <w:ilvl w:val="0"/>
+          <w:numId w:val="1042"/>
+        </w:numPr>
+      </w:pPr>
+      <w:r>
+        <w:t xml:space="preserve">Podcast and YouTube: $5M-$10M</w:t>
+      </w:r>
+    </w:p>
+    <w:p>
+      <w:pPr>
+        <w:pStyle w:val="Compact"/>
+        <w:numPr>
+          <w:ilvl w:val="0"/>
+          <w:numId w:val="1042"/>
+        </w:numPr>
+      </w:pPr>
       <w:r>
         <w:rPr>
           <w:b/>
@@ -7236,8 +7754,2247 @@
         <w:t xml:space="preserve">Document prepared for DealStage LLC | www.thedealstage.com | March 2026 | Confidential</w:t>
       </w:r>
     </w:p>
+    <w:p>
+      <w:r>
+        <w:pict>
+          <v:rect style="width:0;height:1.5pt" o:hralign="center" o:hrstd="t" o:hr="t"/>
+        </w:pict>
+      </w:r>
+    </w:p>
+    <w:p>
+      <w:r>
+        <w:pict>
+          <v:rect style="width:0;height:1.5pt" o:hralign="center" o:hrstd="t" o:hr="t"/>
+        </w:pict>
+      </w:r>
+    </w:p>
     <w:bookmarkEnd w:id="48"/>
     <w:bookmarkEnd w:id="49"/>
+    <w:bookmarkStart w:id="69" w:name="expansion-concept-c-the-agency-additions"/>
+    <w:p>
+      <w:pPr>
+        <w:pStyle w:val="Heading1"/>
+      </w:pPr>
+      <w:r>
+        <w:t xml:space="preserve">EXPANSION CONCEPT C:</w:t>
+      </w:r>
+      <w:r>
+        <w:t xml:space="preserve"> </w:t>
+      </w:r>
+      <w:r>
+        <w:t xml:space="preserve">“THE AGENCY”</w:t>
+      </w:r>
+      <w:r>
+        <w:t xml:space="preserve"> </w:t>
+      </w:r>
+      <w:r>
+        <w:t xml:space="preserve">ADDITIONS</w:t>
+      </w:r>
+    </w:p>
+    <w:p>
+      <w:r>
+        <w:pict>
+          <v:rect style="width:0;height:1.5pt" o:hralign="center" o:hrstd="t" o:hr="t"/>
+        </w:pict>
+      </w:r>
+    </w:p>
+    <w:bookmarkStart w:id="58" w:name="full-season-1-episode-guide-8-episodes"/>
+    <w:p>
+      <w:pPr>
+        <w:pStyle w:val="Heading2"/>
+      </w:pPr>
+      <w:r>
+        <w:t xml:space="preserve">FULL SEASON 1 EPISODE GUIDE — 8 EPISODES</w:t>
+      </w:r>
+    </w:p>
+    <w:p>
+      <w:r>
+        <w:pict>
+          <v:rect style="width:0;height:1.5pt" o:hralign="center" o:hrstd="t" o:hr="t"/>
+        </w:pict>
+      </w:r>
+    </w:p>
+    <w:bookmarkStart w:id="50" w:name="episode-1-day-one"/>
+    <w:p>
+      <w:pPr>
+        <w:pStyle w:val="Heading3"/>
+      </w:pPr>
+      <w:r>
+        <w:t xml:space="preserve">EPISODE 1:</w:t>
+      </w:r>
+      <w:r>
+        <w:t xml:space="preserve"> </w:t>
+      </w:r>
+      <w:r>
+        <w:t xml:space="preserve">“Day One”</w:t>
+      </w:r>
+    </w:p>
+    <w:p>
+      <w:pPr>
+        <w:pStyle w:val="FirstParagraph"/>
+      </w:pPr>
+      <w:r>
+        <w:t xml:space="preserve">The season opens in medias res: the Hartwell Group, a boutique talent management agency operating out of a cramped but stylish office in Los Angeles, is three hours into what should be a routine Monday morning when their largest client — a lifestyle creator with 4.2 million followers and a $1.2 million annual brand deal portfolio — calls to say she has received an offer from a competing agency and has 48 hours to decide whether to leave. The three partners (Victoria, 41, the founder; Marcus Jr., 34, her first hire and now equity partner; and Priya, 29, the rising star who came from a major talent agency) must simultaneously manage the crisis, keep the rest of the roster calm, and close two open deals before end of week. Viewers meet each of the agency’s eight active clients through quick-cut introductions — a gaming creator, a chef, a fitness creator, a musician, and four others — and understand immediately that the Hartwell Group is a company built on personal relationships, running on DealStage data, and held together by three people who each believe they could run the company better alone.</w:t>
+      </w:r>
+    </w:p>
+    <w:p>
+      <w:r>
+        <w:pict>
+          <v:rect style="width:0;height:1.5pt" o:hralign="center" o:hrstd="t" o:hr="t"/>
+        </w:pict>
+      </w:r>
+    </w:p>
+    <w:bookmarkEnd w:id="50"/>
+    <w:bookmarkStart w:id="51" w:name="episode-2-the-pitch"/>
+    <w:p>
+      <w:pPr>
+        <w:pStyle w:val="Heading3"/>
+      </w:pPr>
+      <w:r>
+        <w:t xml:space="preserve">EPISODE 2:</w:t>
+      </w:r>
+      <w:r>
+        <w:t xml:space="preserve"> </w:t>
+      </w:r>
+      <w:r>
+        <w:t xml:space="preserve">“The Pitch”</w:t>
+      </w:r>
+    </w:p>
+    <w:p>
+      <w:pPr>
+        <w:pStyle w:val="FirstParagraph"/>
+      </w:pPr>
+      <w:r>
+        <w:t xml:space="preserve">A $280,000 Nike campaign — the single largest opportunity the Hartwell Group has ever had access to — comes in through a brand manager who has worked with both Marcus Jr. and Priya in previous jobs. Both agents claim the relationship. Both agents want to lead the pitch. Victoria refuses to assign it, believing the competition will produce the best outcome for the client — a decision that creates three weeks of barely suppressed warfare within the agency. The episode follows both agents simultaneously as they develop their pitches for the same Nike brief using the same DealStage platform data, arriving at radically different creative strategies. Marcus Jr.’s approach is data-led and buttoned-up — every recommendation grounded in audience metrics. Priya’s approach is narrative-led and emotionally resonant — she believes Nike does not want a spreadsheet, they want a story. The pitch meeting is the episode’s centerpiece: both agents in the same room, the same client, and the same brand. Only one strategy wins. The other changes everything.</w:t>
+      </w:r>
+    </w:p>
+    <w:p>
+      <w:r>
+        <w:pict>
+          <v:rect style="width:0;height:1.5pt" o:hralign="center" o:hrstd="t" o:hr="t"/>
+        </w:pict>
+      </w:r>
+    </w:p>
+    <w:bookmarkEnd w:id="51"/>
+    <w:bookmarkStart w:id="52" w:name="episode-3-the-breakup"/>
+    <w:p>
+      <w:pPr>
+        <w:pStyle w:val="Heading3"/>
+      </w:pPr>
+      <w:r>
+        <w:t xml:space="preserve">EPISODE 3:</w:t>
+      </w:r>
+      <w:r>
+        <w:t xml:space="preserve"> </w:t>
+      </w:r>
+      <w:r>
+        <w:t xml:space="preserve">“The Breakup”</w:t>
+      </w:r>
+    </w:p>
+    <w:p>
+      <w:pPr>
+        <w:pStyle w:val="FirstParagraph"/>
+      </w:pPr>
+      <w:r>
+        <w:t xml:space="preserve">Their second-largest client — Jordan, a comedy creator with 1.8 million TikTok followers and three active brand partnerships — fires the agency on a Tuesday morning via a four-sentence email. The email is professional. The reason given is</w:t>
+      </w:r>
+      <w:r>
+        <w:t xml:space="preserve"> </w:t>
+      </w:r>
+      <w:r>
+        <w:t xml:space="preserve">“shifting directions.”</w:t>
+      </w:r>
+      <w:r>
+        <w:t xml:space="preserve"> </w:t>
+      </w:r>
+      <w:r>
+        <w:t xml:space="preserve">The actual reason, which the agents piece together over the next six days, is that Jordan signed with a larger agency the week before and has been quietly briefing them on every deal in the pipeline. The episode unfolds in two parallel tracks: Victoria and Marcus Jr. navigate the legal and contractual implications of the departure (there is a non-solicitation clause; there may be a breach), while Priya is tasked with finding a replacement client who can fill the revenue gap within 30 days. The episode ends with Priya identifying three candidates using DealStage’s discovery tools — one of whom is a creator with 400,000 followers who has never had an agent and has been doing deals on her own for two years. The question is not whether she needs representation. The question is whether she knows it yet.</w:t>
+      </w:r>
+    </w:p>
+    <w:p>
+      <w:r>
+        <w:pict>
+          <v:rect style="width:0;height:1.5pt" o:hralign="center" o:hrstd="t" o:hr="t"/>
+        </w:pict>
+      </w:r>
+    </w:p>
+    <w:bookmarkEnd w:id="52"/>
+    <w:bookmarkStart w:id="53" w:name="episode-4-bundle-or-bust"/>
+    <w:p>
+      <w:pPr>
+        <w:pStyle w:val="Heading3"/>
+      </w:pPr>
+      <w:r>
+        <w:t xml:space="preserve">EPISODE 4:</w:t>
+      </w:r>
+      <w:r>
+        <w:t xml:space="preserve"> </w:t>
+      </w:r>
+      <w:r>
+        <w:t xml:space="preserve">“Bundle or Bust”</w:t>
+      </w:r>
+    </w:p>
+    <w:p>
+      <w:pPr>
+        <w:pStyle w:val="FirstParagraph"/>
+      </w:pPr>
+      <w:r>
+        <w:t xml:space="preserve">A senior marketing manager at Spotify contacts the agency with an unusual brief: she does not want one creator. She wants five creators who can collectively represent the full lifestyle spectrum of Spotify’s target demographic — a</w:t>
+      </w:r>
+      <w:r>
+        <w:t xml:space="preserve"> </w:t>
+      </w:r>
+      <w:r>
+        <w:t xml:space="preserve">“campaign package”</w:t>
+      </w:r>
+      <w:r>
+        <w:t xml:space="preserve"> </w:t>
+      </w:r>
+      <w:r>
+        <w:t xml:space="preserve">rather than individual partnerships. Total budget: $500,000. The catch: all five creators must be from the same agency, the content must feel cohesive across five distinct audiences, and the Spotify team has three competing agency pitches to evaluate. The Hartwell Group represents eight creators. Two are clearly right for the brief. Two are maybes. Four are wrong fits entirely. The episode follows the agency’s internal debate about whether to propose their genuinely best fits (risking that the package feels thin) or to stretch the definition of</w:t>
+      </w:r>
+      <w:r>
+        <w:t xml:space="preserve"> </w:t>
+      </w:r>
+      <w:r>
+        <w:t xml:space="preserve">“right fit”</w:t>
+      </w:r>
+      <w:r>
+        <w:t xml:space="preserve"> </w:t>
+      </w:r>
+      <w:r>
+        <w:t xml:space="preserve">to make the package look stronger (risking that Spotify calls it out). The DealStage platform gives them data to argue either way — which turns out to be the problem, not the solution, when every team member uses the same data to reach a different conclusion.</w:t>
+      </w:r>
+    </w:p>
+    <w:p>
+      <w:r>
+        <w:pict>
+          <v:rect style="width:0;height:1.5pt" o:hralign="center" o:hrstd="t" o:hr="t"/>
+        </w:pict>
+      </w:r>
+    </w:p>
+    <w:bookmarkEnd w:id="53"/>
+    <w:bookmarkStart w:id="54" w:name="episode-5-the-newbie"/>
+    <w:p>
+      <w:pPr>
+        <w:pStyle w:val="Heading3"/>
+      </w:pPr>
+      <w:r>
+        <w:t xml:space="preserve">EPISODE 5:</w:t>
+      </w:r>
+      <w:r>
+        <w:t xml:space="preserve"> </w:t>
+      </w:r>
+      <w:r>
+        <w:t xml:space="preserve">“The Newbie”</w:t>
+      </w:r>
+    </w:p>
+    <w:p>
+      <w:pPr>
+        <w:pStyle w:val="FirstParagraph"/>
+      </w:pPr>
+      <w:r>
+        <w:t xml:space="preserve">Devon is 26, six months into his job as a junior agent at the Hartwell Group, and has been watching senior agents close deals for half a year without being given meaningful responsibility. Victoria assigns him his first solo deal: a $35,000 partnership between a fitness creator on their roster and a sports nutrition brand. The deal is small by Hartwell Group standards — routine enough that losing it will not hurt the agency and winning it will not transform it. For Devon, it is everything. The episode follows him through every step of the process: reading the DealStage AI recommendation for the first time and not fully understanding it, calling the brand manager and stumbling through the introduction, sending a rate card with the wrong numbers, correcting it, negotiating a second time, almost losing the deal over a usage rights clause nobody explained to him, and finally closing it — not elegantly, not perfectly, but completely. The episode ends with Devon calling his mother. The audience realizes they have watched something more important than a $35,000 deal.</w:t>
+      </w:r>
+    </w:p>
+    <w:p>
+      <w:r>
+        <w:pict>
+          <v:rect style="width:0;height:1.5pt" o:hralign="center" o:hrstd="t" o:hr="t"/>
+        </w:pict>
+      </w:r>
+    </w:p>
+    <w:bookmarkEnd w:id="54"/>
+    <w:bookmarkStart w:id="55" w:name="episode-6-the-competitor"/>
+    <w:p>
+      <w:pPr>
+        <w:pStyle w:val="Heading3"/>
+      </w:pPr>
+      <w:r>
+        <w:t xml:space="preserve">EPISODE 6:</w:t>
+      </w:r>
+      <w:r>
+        <w:t xml:space="preserve"> </w:t>
+      </w:r>
+      <w:r>
+        <w:t xml:space="preserve">“The Competitor”</w:t>
+      </w:r>
+    </w:p>
+    <w:p>
+      <w:pPr>
+        <w:pStyle w:val="FirstParagraph"/>
+      </w:pPr>
+      <w:r>
+        <w:t xml:space="preserve">Nexus Talent, the largest creator management firm in Los Angeles, has been circling the Hartwell Group’s roster for two seasons. In episode 6, they make their first direct move: they approach the agency’s most valuable emerging client — a beauty creator named Simone with 800,000 followers and a trajectory that every data model says will reach 2 million within 18 months — and offer her a deal that the Hartwell Group cannot financially match. Victoria knows about the approach within 24 hours (the creator called her immediately and honestly — which is the episode’s first genuine surprise). The question is not whether to fight for Simone. It is how. Nexus has money, connections, and 40 agents. The Hartwell Group has a three-person senior team, a junior agent, eight other clients, and the DealStage platform’s data showing that Simone’s deal rates have increased 340% since signing with them. Victoria’s pitch to keep Simone is not about matching the competitor’s offer. It is about proving that what they built together cannot be replicated at scale.</w:t>
+      </w:r>
+    </w:p>
+    <w:p>
+      <w:r>
+        <w:pict>
+          <v:rect style="width:0;height:1.5pt" o:hralign="center" o:hrstd="t" o:hr="t"/>
+        </w:pict>
+      </w:r>
+    </w:p>
+    <w:bookmarkEnd w:id="55"/>
+    <w:bookmarkStart w:id="56" w:name="episode-7-the-comeback"/>
+    <w:p>
+      <w:pPr>
+        <w:pStyle w:val="Heading3"/>
+      </w:pPr>
+      <w:r>
+        <w:t xml:space="preserve">EPISODE 7:</w:t>
+      </w:r>
+      <w:r>
+        <w:t xml:space="preserve"> </w:t>
+      </w:r>
+      <w:r>
+        <w:t xml:space="preserve">“The Comeback”</w:t>
+      </w:r>
+    </w:p>
+    <w:p>
+      <w:pPr>
+        <w:pStyle w:val="FirstParagraph"/>
+      </w:pPr>
+      <w:r>
+        <w:t xml:space="preserve">Two seasons ago, the Hartwell Group fired its third partner — a founding-era agent named Raymond who left (or was pushed out, depending on who tells the story) after a series of deals that underperformed and one that nearly ended in litigation. Raymond has spent the intervening years managing a single client independently: a creator who has quietly grown from 200,000 followers to 1.4 million and just received an approach from a Fortune 100 brand for a campaign worth $400,000 — the largest deal either Raymond or his client has ever encountered. Raymond cannot close it alone. His client will not sign with a large agency. Priya, who was Raymond’s mentee before the falling-out, calls Victoria with a proposal: bring Raymond in on a commission basis to co-represent this one deal, using the Hartwell Group’s infrastructure and the DealStage platform’s capabilities. Victoria refuses. Then the brand calls to say they want the deal closed by Friday. The episode is about what happens when the correct professional decision and the correct personal decision point in opposite directions — and what a founder does when she realizes they are not the same thing.</w:t>
+      </w:r>
+    </w:p>
+    <w:p>
+      <w:r>
+        <w:pict>
+          <v:rect style="width:0;height:1.5pt" o:hralign="center" o:hrstd="t" o:hr="t"/>
+        </w:pict>
+      </w:r>
+    </w:p>
+    <w:bookmarkEnd w:id="56"/>
+    <w:bookmarkStart w:id="57" w:name="episode-8-season-finale"/>
+    <w:p>
+      <w:pPr>
+        <w:pStyle w:val="Heading3"/>
+      </w:pPr>
+      <w:r>
+        <w:t xml:space="preserve">EPISODE 8:</w:t>
+      </w:r>
+      <w:r>
+        <w:t xml:space="preserve"> </w:t>
+      </w:r>
+      <w:r>
+        <w:t xml:space="preserve">“Season Finale”</w:t>
+      </w:r>
+    </w:p>
+    <w:p>
+      <w:pPr>
+        <w:pStyle w:val="FirstParagraph"/>
+      </w:pPr>
+      <w:r>
+        <w:t xml:space="preserve">Everything from seven episodes comes due simultaneously. The Nike deal from episode 2 is in final contract negotiations — and the brand has added a usage rights clause that changes the economics significantly. The creator Priya identified in episode 3 has agreed to a representation conversation, but she is also talking to two other agencies. The Spotify bundle deal is on the table with a 48-hour decision window and the agency is still one creator short of the package they pitched. Devon’s fitness creator client has a conflict with a new brand deal that nobody caught in contracting. And Raymond’s $400,000 deal — which Victoria ultimately agreed to co-represent — is in jeopardy because the brand’s legal team has found a historical post on the creator’s account that violates the content exclusivity clause. The season finale does not resolve everything. One deal closes. One relationship ends. One agent makes a decision that will define the next season. And in the final scene, the DealStage platform delivers a quarterly intelligence report showing the Hartwell Group’s portfolio performance — and the number on screen tells the audience exactly how much the agency has grown in eight episodes. It is more than anyone expected. It is also, somehow, not enough.</w:t>
+      </w:r>
+    </w:p>
+    <w:p>
+      <w:r>
+        <w:pict>
+          <v:rect style="width:0;height:1.5pt" o:hralign="center" o:hrstd="t" o:hr="t"/>
+        </w:pict>
+      </w:r>
+    </w:p>
+    <w:p>
+      <w:r>
+        <w:pict>
+          <v:rect style="width:0;height:1.5pt" o:hralign="center" o:hrstd="t" o:hr="t"/>
+        </w:pict>
+      </w:r>
+    </w:p>
+    <w:bookmarkEnd w:id="57"/>
+    <w:bookmarkEnd w:id="58"/>
+    <w:bookmarkStart w:id="63" w:name="real-agency-partnership-strategy"/>
+    <w:p>
+      <w:pPr>
+        <w:pStyle w:val="Heading2"/>
+      </w:pPr>
+      <w:r>
+        <w:t xml:space="preserve">REAL AGENCY PARTNERSHIP STRATEGY</w:t>
+      </w:r>
+    </w:p>
+    <w:p>
+      <w:pPr>
+        <w:pStyle w:val="FirstParagraph"/>
+      </w:pPr>
+      <w:r>
+        <w:t xml:space="preserve">The Agency’s authenticity depends on genuine access to real talent management professionals. The following strategy outlines how DealStage approaches real agencies for partnership, what each party gains, and how to protect client confidentiality while maintaining the show’s documentary integrity.</w:t>
+      </w:r>
+    </w:p>
+    <w:p>
+      <w:r>
+        <w:pict>
+          <v:rect style="width:0;height:1.5pt" o:hralign="center" o:hrstd="t" o:hr="t"/>
+        </w:pict>
+      </w:r>
+    </w:p>
+    <w:bookmarkStart w:id="59" w:name="how-to-approach-real-agencies"/>
+    <w:p>
+      <w:pPr>
+        <w:pStyle w:val="Heading3"/>
+      </w:pPr>
+      <w:r>
+        <w:t xml:space="preserve">HOW TO APPROACH REAL AGENCIES</w:t>
+      </w:r>
+    </w:p>
+    <w:p>
+      <w:pPr>
+        <w:pStyle w:val="FirstParagraph"/>
+      </w:pPr>
+      <w:r>
+        <w:t xml:space="preserve">The major talent agencies — WME, CAA, UTA, Wasserman, Night — are not the right first targets. Their scale, legal infrastructure, and existing media relationships create more friction than opportunity for a first-season partnership. The right approach is a three-tier strategy:</w:t>
+      </w:r>
+    </w:p>
+    <w:p>
+      <w:pPr>
+        <w:pStyle w:val="BodyText"/>
+      </w:pPr>
+      <w:r>
+        <w:t xml:space="preserve">Tier 1 — Mid-size boutique agencies (the ideal partners): Look for agencies with 5–20 full-time staff, a creator-first (not celebrity-first) focus, and a portfolio of clients in the $500K–$5M annual deal range. These agencies have enough deal flow to generate compelling episodes without the bureaucratic constraints of major agencies. Target cities: Los Angeles, New York, Austin, and Nashville (for music-forward agencies).</w:t>
+      </w:r>
+    </w:p>
+    <w:p>
+      <w:pPr>
+        <w:pStyle w:val="BodyText"/>
+      </w:pPr>
+      <w:r>
+        <w:t xml:space="preserve">Tier 2 — Independent managers with notable rosters: Individual managers who represent 3–8 creators exclusively, often without a formal agency structure. These managers can be embedded in the show as secondary characters or as single-episode partners, giving the show access to the most intimate version of talent management — one person, their phone, and their relationships.</w:t>
+      </w:r>
+    </w:p>
+    <w:p>
+      <w:pPr>
+        <w:pStyle w:val="BodyText"/>
+      </w:pPr>
+      <w:r>
+        <w:t xml:space="preserve">Tier 3 — Former major agency agents who have gone independent: Agents who left WME, CAA, or UTA in the past three years and launched their own practices. They have major agency training and credibility without major agency restrictions. They are also more likely to be interested in the exposure value the show provides.</w:t>
+      </w:r>
+    </w:p>
+    <w:p>
+      <w:pPr>
+        <w:pStyle w:val="BodyText"/>
+      </w:pPr>
+      <w:r>
+        <w:t xml:space="preserve">Outreach approach: Do not lead with</w:t>
+      </w:r>
+      <w:r>
+        <w:t xml:space="preserve"> </w:t>
+      </w:r>
+      <w:r>
+        <w:t xml:space="preserve">“TV show.”</w:t>
+      </w:r>
+      <w:r>
+        <w:t xml:space="preserve"> </w:t>
+      </w:r>
+      <w:r>
+        <w:t xml:space="preserve">Lead with DealStage’s data offer — a free annual enterprise subscription to the platform, a category intelligence report for their specific creator roster, and a meeting to discuss how the platform can improve their deal flow. The TV partnership conversation happens in the second meeting, after the agency has seen the platform’s capabilities and begun to trust the relationship.</w:t>
+      </w:r>
+    </w:p>
+    <w:p>
+      <w:r>
+        <w:pict>
+          <v:rect style="width:0;height:1.5pt" o:hralign="center" o:hrstd="t" o:hr="t"/>
+        </w:pict>
+      </w:r>
+    </w:p>
+    <w:bookmarkEnd w:id="59"/>
+    <w:bookmarkStart w:id="60" w:name="what-is-in-it-for-them"/>
+    <w:p>
+      <w:pPr>
+        <w:pStyle w:val="Heading3"/>
+      </w:pPr>
+      <w:r>
+        <w:t xml:space="preserve">WHAT IS IN IT FOR THEM</w:t>
+      </w:r>
+    </w:p>
+    <w:p>
+      <w:pPr>
+        <w:pStyle w:val="FirstParagraph"/>
+      </w:pPr>
+      <w:r>
+        <w:t xml:space="preserve">Real agencies considering a partnership with The Agency must see clear, measurable upside that outweighs the risks of public exposure. The value proposition has five components:</w:t>
+      </w:r>
+    </w:p>
+    <w:p>
+      <w:pPr>
+        <w:numPr>
+          <w:ilvl w:val="0"/>
+          <w:numId w:val="1043"/>
+        </w:numPr>
+      </w:pPr>
+      <w:r>
+        <w:t xml:space="preserve">DealStage platform access: Full enterprise subscription for the duration of filming and one year post-broadcast, including AI match scoring, fair market rate data, contract analysis, and campaign performance tracking. Estimated market value: $60,000–$120,000 annually.</w:t>
+      </w:r>
+    </w:p>
+    <w:p>
+      <w:pPr>
+        <w:numPr>
+          <w:ilvl w:val="0"/>
+          <w:numId w:val="1043"/>
+        </w:numPr>
+      </w:pPr>
+      <w:r>
+        <w:t xml:space="preserve">Deal flow exposure: Every episode featuring the agency is a demo reel for their capabilities shown to a national audience that includes brands, other creators, and potential employees. The Agency is the most effective talent recruitment and business development tool the agency will ever have.</w:t>
+      </w:r>
+    </w:p>
+    <w:p>
+      <w:pPr>
+        <w:numPr>
+          <w:ilvl w:val="0"/>
+          <w:numId w:val="1043"/>
+        </w:numPr>
+      </w:pPr>
+      <w:r>
+        <w:t xml:space="preserve">Brand partnership introductions: DealStage’s brand partner network — every company that works with the platform — becomes accessible to the featured agency as direct introductions, not cold outreach. The show’s brand partners are pre-qualified buyers of exactly what the agency sells.</w:t>
+      </w:r>
+    </w:p>
+    <w:p>
+      <w:pPr>
+        <w:numPr>
+          <w:ilvl w:val="0"/>
+          <w:numId w:val="1043"/>
+        </w:numPr>
+      </w:pPr>
+      <w:r>
+        <w:t xml:space="preserve">Data intelligence: The DealStage platform’s aggregated data about deal rates in the featured agency’s specific category is available as part of the partnership — information that is not publicly available and represents genuine competitive advantage.</w:t>
+      </w:r>
+    </w:p>
+    <w:p>
+      <w:pPr>
+        <w:numPr>
+          <w:ilvl w:val="0"/>
+          <w:numId w:val="1043"/>
+        </w:numPr>
+      </w:pPr>
+      <w:r>
+        <w:t xml:space="preserve">Narrative control: Unlike traditional documentary access, DealStage and the featured agency co-develop the season arc in advance. The agency knows what story is being told. They do not control the edit, but they have seen the season outline before filming begins.</w:t>
+      </w:r>
+    </w:p>
+    <w:p>
+      <w:r>
+        <w:pict>
+          <v:rect style="width:0;height:1.5pt" o:hralign="center" o:hrstd="t" o:hr="t"/>
+        </w:pict>
+      </w:r>
+    </w:p>
+    <w:bookmarkEnd w:id="60"/>
+    <w:bookmarkStart w:id="61" w:name="legal-considerations"/>
+    <w:p>
+      <w:pPr>
+        <w:pStyle w:val="Heading3"/>
+      </w:pPr>
+      <w:r>
+        <w:t xml:space="preserve">LEGAL CONSIDERATIONS</w:t>
+      </w:r>
+    </w:p>
+    <w:p>
+      <w:pPr>
+        <w:pStyle w:val="FirstParagraph"/>
+      </w:pPr>
+      <w:r>
+        <w:t xml:space="preserve">Client privacy is the central legal challenge. Every brand deal shown on screen involves a real creator who has not necessarily consented to their deal terms being televised. The legal framework requires:</w:t>
+      </w:r>
+    </w:p>
+    <w:p>
+      <w:pPr>
+        <w:pStyle w:val="BodyText"/>
+      </w:pPr>
+      <w:r>
+        <w:t xml:space="preserve">Client consent release: Every creator whose deal is featured must sign a specific consent release that covers deal terms, on-screen discussion of their business, and any data shown on the DealStage platform display. Consent is voluntary — if a creator declines, their deals are excluded from featured episodes.</w:t>
+      </w:r>
+    </w:p>
+    <w:p>
+      <w:pPr>
+        <w:pStyle w:val="BodyText"/>
+      </w:pPr>
+      <w:r>
+        <w:t xml:space="preserve">Deal confidentiality: Brand deal values shown on screen must be cleared by both the creator and the brand. Some brands will decline; their deals are handled in aggregate (</w:t>
+      </w:r>
+      <w:r>
+        <w:t xml:space="preserve">“a campaign in the seven-figure range”</w:t>
+      </w:r>
+      <w:r>
+        <w:t xml:space="preserve">) rather than specifically.</w:t>
+      </w:r>
+    </w:p>
+    <w:p>
+      <w:pPr>
+        <w:pStyle w:val="BodyText"/>
+      </w:pPr>
+      <w:r>
+        <w:t xml:space="preserve">AI data display: The DealStage platform scores and recommendations shown on screen are specifically cleared for broadcast and do not represent the platform’s proprietary algorithm in sufficient detail to constitute a trade secret disclosure.</w:t>
+      </w:r>
+    </w:p>
+    <w:p>
+      <w:pPr>
+        <w:pStyle w:val="BodyText"/>
+      </w:pPr>
+      <w:r>
+        <w:t xml:space="preserve">Non-compete provisions: The featured agency must agree that the show partnership does not preclude DealStage from working with competing agencies in other markets or for other show formats.</w:t>
+      </w:r>
+    </w:p>
+    <w:p>
+      <w:r>
+        <w:pict>
+          <v:rect style="width:0;height:1.5pt" o:hralign="center" o:hrstd="t" o:hr="t"/>
+        </w:pict>
+      </w:r>
+    </w:p>
+    <w:bookmarkEnd w:id="61"/>
+    <w:bookmarkStart w:id="62" w:name="X4b0a521031321f062332fee3b9ec1061245b799"/>
+    <w:p>
+      <w:pPr>
+        <w:pStyle w:val="Heading3"/>
+      </w:pPr>
+      <w:r>
+        <w:t xml:space="preserve">ALTERNATIVE APPROACH: ASSEMBLED CAST OF INDEPENDENT AGENTS</w:t>
+      </w:r>
+    </w:p>
+    <w:p>
+      <w:pPr>
+        <w:pStyle w:val="FirstParagraph"/>
+      </w:pPr>
+      <w:r>
+        <w:t xml:space="preserve">If partnership with an existing agency proves legally or logistically complex, The Agency can be produced with an assembled cast of real but independent agents and managers who do not currently share an office or employer. The show would follow three to five real professionals who are brought together for a</w:t>
+      </w:r>
+      <w:r>
+        <w:t xml:space="preserve"> </w:t>
+      </w:r>
+      <w:r>
+        <w:t xml:space="preserve">“collective”</w:t>
+      </w:r>
+      <w:r>
+        <w:t xml:space="preserve"> </w:t>
+      </w:r>
+      <w:r>
+        <w:t xml:space="preserve">structure — sharing office space and platform access for the production period while maintaining separate businesses.</w:t>
+      </w:r>
+    </w:p>
+    <w:p>
+      <w:pPr>
+        <w:pStyle w:val="BodyText"/>
+      </w:pPr>
+      <w:r>
+        <w:t xml:space="preserve">This structure offers several advantages: it eliminates client confidentiality issues associated with a single agency’s full roster, it allows casting across different talent categories (one agent specializing in athletes, one in beauty creators, one in musicians), it creates natural conflict and dynamic from the first day because these are genuine competitors who have been asked to collaborate, and it demonstrates DealStage’s platform at scale across categories rather than within a single agency’s lane.</w:t>
+      </w:r>
+    </w:p>
+    <w:p>
+      <w:pPr>
+        <w:pStyle w:val="BodyText"/>
+      </w:pPr>
+      <w:r>
+        <w:t xml:space="preserve">The assembled cast approach is the production-risk mitigation option. The real agency partnership is the preferred option. Both produce compelling television.</w:t>
+      </w:r>
+    </w:p>
+    <w:p>
+      <w:r>
+        <w:pict>
+          <v:rect style="width:0;height:1.5pt" o:hralign="center" o:hrstd="t" o:hr="t"/>
+        </w:pict>
+      </w:r>
+    </w:p>
+    <w:p>
+      <w:r>
+        <w:pict>
+          <v:rect style="width:0;height:1.5pt" o:hralign="center" o:hrstd="t" o:hr="t"/>
+        </w:pict>
+      </w:r>
+    </w:p>
+    <w:bookmarkEnd w:id="62"/>
+    <w:bookmarkEnd w:id="63"/>
+    <w:bookmarkStart w:id="68" w:name="spin-off-potential-from-the-agency"/>
+    <w:p>
+      <w:pPr>
+        <w:pStyle w:val="Heading2"/>
+      </w:pPr>
+      <w:r>
+        <w:t xml:space="preserve">SPIN-OFF POTENTIAL FROM</w:t>
+      </w:r>
+      <w:r>
+        <w:t xml:space="preserve"> </w:t>
+      </w:r>
+      <w:r>
+        <w:t xml:space="preserve">“THE AGENCY”</w:t>
+      </w:r>
+    </w:p>
+    <w:p>
+      <w:r>
+        <w:pict>
+          <v:rect style="width:0;height:1.5pt" o:hralign="center" o:hrstd="t" o:hr="t"/>
+        </w:pict>
+      </w:r>
+    </w:p>
+    <w:bookmarkStart w:id="64" w:name="X895edcab06992b475d644f3266f07c5ee95db50"/>
+    <w:p>
+      <w:pPr>
+        <w:pStyle w:val="Heading3"/>
+      </w:pPr>
+      <w:r>
+        <w:t xml:space="preserve">“THE AGENT”</w:t>
+      </w:r>
+      <w:r>
+        <w:t xml:space="preserve"> </w:t>
+      </w:r>
+      <w:r>
+        <w:t xml:space="preserve">— SINGLE SUBJECT DOCUMENTARY SERIES</w:t>
+      </w:r>
+    </w:p>
+    <w:p>
+      <w:pPr>
+        <w:pStyle w:val="FirstParagraph"/>
+      </w:pPr>
+      <w:r>
+        <w:t xml:space="preserve">Follow one agent — ideally the season’s breakout personality — across an entire calendar year of their professional life. Not a competition, not a docuseries ensemble. One person, one year, one business.</w:t>
+      </w:r>
+    </w:p>
+    <w:p>
+      <w:pPr>
+        <w:pStyle w:val="BodyText"/>
+      </w:pPr>
+      <w:r>
+        <w:t xml:space="preserve">The premise: Talent management is one of the most relationship-driven businesses in the world, and the relationships are almost never visible.</w:t>
+      </w:r>
+      <w:r>
+        <w:t xml:space="preserve"> </w:t>
+      </w:r>
+      <w:r>
+        <w:t xml:space="preserve">“The Agent”</w:t>
+      </w:r>
+      <w:r>
+        <w:t xml:space="preserve"> </w:t>
+      </w:r>
+      <w:r>
+        <w:t xml:space="preserve">makes the invisible visible — every relationship cultivation call, every deal that dies in negotiation, every client crisis that happens at 11pm on a Friday, every win that only the agent and the creator know about. The DealStage platform serves as a running dashboard — viewers see the agent’s portfolio value grow (or shrink) in real time as the year progresses.</w:t>
+      </w:r>
+    </w:p>
+    <w:p>
+      <w:pPr>
+        <w:pStyle w:val="BodyText"/>
+      </w:pPr>
+      <w:r>
+        <w:t xml:space="preserve">Format: 6-episode limited series, 45 minutes per episode. Designed for streaming rather than network. The emotional register is closer to a character study than a competition — think the documentary filmmaking of</w:t>
+      </w:r>
+      <w:r>
+        <w:t xml:space="preserve"> </w:t>
+      </w:r>
+      <w:r>
+        <w:t xml:space="preserve">“Last Chance U”</w:t>
+      </w:r>
+      <w:r>
+        <w:t xml:space="preserve"> </w:t>
+      </w:r>
+      <w:r>
+        <w:t xml:space="preserve">applied to the creator economy.</w:t>
+      </w:r>
+    </w:p>
+    <w:p>
+      <w:pPr>
+        <w:pStyle w:val="BodyText"/>
+      </w:pPr>
+      <w:r>
+        <w:t xml:space="preserve">Target network: Netflix documentary division, HBO, or Apple TV+. The single-subject format allows for the depth of access that these premium documentary platforms value.</w:t>
+      </w:r>
+    </w:p>
+    <w:p>
+      <w:r>
+        <w:pict>
+          <v:rect style="width:0;height:1.5pt" o:hralign="center" o:hrstd="t" o:hr="t"/>
+        </w:pict>
+      </w:r>
+    </w:p>
+    <w:bookmarkEnd w:id="64"/>
+    <w:bookmarkStart w:id="65" w:name="X8ce1f602aec8826eb896d5c1fba75e670a3b42b"/>
+    <w:p>
+      <w:pPr>
+        <w:pStyle w:val="Heading3"/>
+      </w:pPr>
+      <w:r>
+        <w:t xml:space="preserve">“THE ROOKIE”</w:t>
+      </w:r>
+      <w:r>
+        <w:t xml:space="preserve"> </w:t>
+      </w:r>
+      <w:r>
+        <w:t xml:space="preserve">— COMPETITION FORMAT FOR NEW AGENTS</w:t>
+      </w:r>
+    </w:p>
+    <w:p>
+      <w:pPr>
+        <w:pStyle w:val="FirstParagraph"/>
+      </w:pPr>
+      <w:r>
+        <w:t xml:space="preserve">A competition series in which six aspiring talent agents — all under 26, all entering the industry for the first time — are placed in a working agency environment and given real clients, real deals, and real consequences for their decisions.</w:t>
+      </w:r>
+    </w:p>
+    <w:p>
+      <w:pPr>
+        <w:pStyle w:val="BodyText"/>
+      </w:pPr>
+      <w:r>
+        <w:t xml:space="preserve">The format follows</w:t>
+      </w:r>
+      <w:r>
+        <w:t xml:space="preserve"> </w:t>
+      </w:r>
+      <w:r>
+        <w:t xml:space="preserve">“The Agency”</w:t>
+      </w:r>
+      <w:r>
+        <w:t xml:space="preserve"> </w:t>
+      </w:r>
+      <w:r>
+        <w:t xml:space="preserve">in that the deals are real and the DealStage platform is the operational backbone. The difference: the agents are inexperienced, and watching inexperience navigate a genuinely complex industry is a different kind of compelling than watching expertise.</w:t>
+      </w:r>
+    </w:p>
+    <w:p>
+      <w:pPr>
+        <w:pStyle w:val="BodyText"/>
+      </w:pPr>
+      <w:r>
+        <w:t xml:space="preserve">Devon from episode 5 of The Agency is the prototype for every contestant in</w:t>
+      </w:r>
+      <w:r>
+        <w:t xml:space="preserve"> </w:t>
+      </w:r>
+      <w:r>
+        <w:t xml:space="preserve">“The Rookie”</w:t>
+      </w:r>
+      <w:r>
+        <w:t xml:space="preserve"> </w:t>
+      </w:r>
+      <w:r>
+        <w:t xml:space="preserve">— someone who knows enough to be dangerous, not enough to be safe, and cares deeply enough to be worth watching.</w:t>
+      </w:r>
+    </w:p>
+    <w:p>
+      <w:pPr>
+        <w:pStyle w:val="BodyText"/>
+      </w:pPr>
+      <w:r>
+        <w:t xml:space="preserve">Format: 8 episodes, network or streaming. The finale features each contestant pitching for a permanent position at a real talent management agency — not the Hartwell Group (which is fictional) but a real agency that has agreed to offer one position to the best performer.</w:t>
+      </w:r>
+    </w:p>
+    <w:p>
+      <w:r>
+        <w:pict>
+          <v:rect style="width:0;height:1.5pt" o:hralign="center" o:hrstd="t" o:hr="t"/>
+        </w:pict>
+      </w:r>
+    </w:p>
+    <w:bookmarkEnd w:id="65"/>
+    <w:bookmarkStart w:id="66" w:name="the-roster-talent-side-companion-series"/>
+    <w:p>
+      <w:pPr>
+        <w:pStyle w:val="Heading3"/>
+      </w:pPr>
+      <w:r>
+        <w:t xml:space="preserve">“THE ROSTER”</w:t>
+      </w:r>
+      <w:r>
+        <w:t xml:space="preserve"> </w:t>
+      </w:r>
+      <w:r>
+        <w:t xml:space="preserve">— TALENT-SIDE COMPANION SERIES</w:t>
+      </w:r>
+    </w:p>
+    <w:p>
+      <w:pPr>
+        <w:pStyle w:val="FirstParagraph"/>
+      </w:pPr>
+      <w:r>
+        <w:t xml:space="preserve">Where The Agency follows the people who manage talent,</w:t>
+      </w:r>
+      <w:r>
+        <w:t xml:space="preserve"> </w:t>
+      </w:r>
+      <w:r>
+        <w:t xml:space="preserve">“The Roster”</w:t>
+      </w:r>
+      <w:r>
+        <w:t xml:space="preserve"> </w:t>
+      </w:r>
+      <w:r>
+        <w:t xml:space="preserve">follows the talent themselves — the creators who are represented by an agency, navigating the strange and sometimes adversarial relationship between their authentic creative identity and the commercial machine their agent is building around them.</w:t>
+      </w:r>
+    </w:p>
+    <w:p>
+      <w:pPr>
+        <w:pStyle w:val="BodyText"/>
+      </w:pPr>
+      <w:r>
+        <w:t xml:space="preserve">This is not a competition. It is a character ensemble — four to six creators of different types (athlete, musician, beauty creator, podcaster, gaming streamer) who share the same management company but almost never speak to each other, each navigating a different chapter of the same fundamental journey: what does it actually cost to turn a following into a business?</w:t>
+      </w:r>
+    </w:p>
+    <w:p>
+      <w:pPr>
+        <w:pStyle w:val="BodyText"/>
+      </w:pPr>
+      <w:r>
+        <w:t xml:space="preserve">The DealStage platform appears in</w:t>
+      </w:r>
+      <w:r>
+        <w:t xml:space="preserve"> </w:t>
+      </w:r>
+      <w:r>
+        <w:t xml:space="preserve">“The Roster”</w:t>
+      </w:r>
+      <w:r>
+        <w:t xml:space="preserve"> </w:t>
+      </w:r>
+      <w:r>
+        <w:t xml:space="preserve">from the creator’s point of view — which is fundamentally different from the agent’s point of view shown in The Agency. The creator sees their own data for the first time, often in the same episode where their agent is using that same data to close a deal the creator does not yet know about. The information asymmetry between creator and agent is the show’s structural tension.</w:t>
+      </w:r>
+    </w:p>
+    <w:p>
+      <w:r>
+        <w:pict>
+          <v:rect style="width:0;height:1.5pt" o:hralign="center" o:hrstd="t" o:hr="t"/>
+        </w:pict>
+      </w:r>
+    </w:p>
+    <w:bookmarkEnd w:id="66"/>
+    <w:bookmarkStart w:id="67" w:name="international-versions"/>
+    <w:p>
+      <w:pPr>
+        <w:pStyle w:val="Heading3"/>
+      </w:pPr>
+      <w:r>
+        <w:t xml:space="preserve">INTERNATIONAL VERSIONS</w:t>
+      </w:r>
+    </w:p>
+    <w:p>
+      <w:pPr>
+        <w:pStyle w:val="FirstParagraph"/>
+      </w:pPr>
+      <w:r>
+        <w:t xml:space="preserve">“The Agency”</w:t>
+      </w:r>
+      <w:r>
+        <w:t xml:space="preserve"> </w:t>
+      </w:r>
+      <w:r>
+        <w:t xml:space="preserve">is the most internationally adaptable format in the DealStage media empire because talent management agencies exist in every major creator market and face broadly similar structural challenges. The following international versions represent the highest-priority expansion markets:</w:t>
+      </w:r>
+    </w:p>
+    <w:p>
+      <w:pPr>
+        <w:pStyle w:val="BodyText"/>
+      </w:pPr>
+      <w:r>
+        <w:rPr>
+          <w:b/>
+          <w:bCs/>
+        </w:rPr>
+        <w:t xml:space="preserve">London:</w:t>
+      </w:r>
+      <w:r>
+        <w:t xml:space="preserve"> </w:t>
+      </w:r>
+      <w:r>
+        <w:t xml:space="preserve">The UK creator economy is the third-largest in the world, with a specific concentration in fashion, food, and lifestyle categories. British talent management has a distinct culture — more formal, more process-driven, with stronger union and guild infrastructure than the US market. A London version of The Agency would explore how DealStage’s AI tools interact with a more regulated partnership environment.</w:t>
+      </w:r>
+    </w:p>
+    <w:p>
+      <w:pPr>
+        <w:pStyle w:val="BodyText"/>
+      </w:pPr>
+      <w:r>
+        <w:rPr>
+          <w:b/>
+          <w:bCs/>
+        </w:rPr>
+        <w:t xml:space="preserve">Tokyo:</w:t>
+      </w:r>
+      <w:r>
+        <w:t xml:space="preserve"> </w:t>
+      </w:r>
+      <w:r>
+        <w:t xml:space="preserve">The Japanese creator economy is among the most unique in the world — characterized by extremely high production values, strong platform-specific creator cultures (NicoNico, LINE, YouTube Japan), and brand partnership norms that prioritize long-term relationship-building over transactional deal-making. A Tokyo version explores how the DealStage model adapts to a market where the deal is the beginning of the relationship, not the end.</w:t>
+      </w:r>
+    </w:p>
+    <w:p>
+      <w:pPr>
+        <w:pStyle w:val="BodyText"/>
+      </w:pPr>
+      <w:r>
+        <w:rPr>
+          <w:b/>
+          <w:bCs/>
+        </w:rPr>
+        <w:t xml:space="preserve">Seoul:</w:t>
+      </w:r>
+      <w:r>
+        <w:t xml:space="preserve"> </w:t>
+      </w:r>
+      <w:r>
+        <w:t xml:space="preserve">The Korean creator economy is one of the fastest-growing in the world, driven by K-pop, K-beauty, and the global reach of Korean cultural content. A Seoul version of The Agency would follow agents who represent creators operating simultaneously in Korean, English, and global markets — managing deals across three cultural frameworks at once.</w:t>
+      </w:r>
+    </w:p>
+    <w:p>
+      <w:pPr>
+        <w:pStyle w:val="BodyText"/>
+      </w:pPr>
+      <w:r>
+        <w:rPr>
+          <w:b/>
+          <w:bCs/>
+        </w:rPr>
+        <w:t xml:space="preserve">Sao Paulo:</w:t>
+      </w:r>
+      <w:r>
+        <w:t xml:space="preserve"> </w:t>
+      </w:r>
+      <w:r>
+        <w:t xml:space="preserve">Brazil’s creator economy is the largest in Latin America and among the most dynamic in the world. Brazilian creators operate in a market with unique platform preferences (WhatsApp and Instagram dominate in ways they do not elsewhere), unique brand deal structures (performance fees are more common than flat rates), and a cultural relationship between talent and audience that is more intensely personal than almost anywhere else. A Sao Paulo version would be the most emotionally resonant of all the international adaptations.</w:t>
+      </w:r>
+    </w:p>
+    <w:p>
+      <w:r>
+        <w:pict>
+          <v:rect style="width:0;height:1.5pt" o:hralign="center" o:hrstd="t" o:hr="t"/>
+        </w:pict>
+      </w:r>
+    </w:p>
+    <w:p>
+      <w:r>
+        <w:pict>
+          <v:rect style="width:0;height:1.5pt" o:hralign="center" o:hrstd="t" o:hr="t"/>
+        </w:pict>
+      </w:r>
+    </w:p>
+    <w:bookmarkEnd w:id="67"/>
+    <w:bookmarkEnd w:id="68"/>
+    <w:bookmarkEnd w:id="69"/>
+    <w:bookmarkStart w:id="93" w:name="X57997a7802552ea5e5375d65ccbc5d1f7fab6fa"/>
+    <w:p>
+      <w:pPr>
+        <w:pStyle w:val="Heading1"/>
+      </w:pPr>
+      <w:r>
+        <w:t xml:space="preserve">EXPANSION CONCEPT D:</w:t>
+      </w:r>
+      <w:r>
+        <w:t xml:space="preserve"> </w:t>
+      </w:r>
+      <w:r>
+        <w:t xml:space="preserve">“BRAND VS. BRAND”</w:t>
+      </w:r>
+      <w:r>
+        <w:t xml:space="preserve"> </w:t>
+      </w:r>
+      <w:r>
+        <w:t xml:space="preserve">ADDITIONS</w:t>
+      </w:r>
+    </w:p>
+    <w:p>
+      <w:r>
+        <w:pict>
+          <v:rect style="width:0;height:1.5pt" o:hralign="center" o:hrstd="t" o:hr="t"/>
+        </w:pict>
+      </w:r>
+    </w:p>
+    <w:bookmarkStart w:id="80" w:name="full-season-1-matchup-guide-10-episodes"/>
+    <w:p>
+      <w:pPr>
+        <w:pStyle w:val="Heading2"/>
+      </w:pPr>
+      <w:r>
+        <w:t xml:space="preserve">FULL SEASON 1 MATCHUP GUIDE — 10 EPISODES</w:t>
+      </w:r>
+    </w:p>
+    <w:p>
+      <w:r>
+        <w:pict>
+          <v:rect style="width:0;height:1.5pt" o:hralign="center" o:hrstd="t" o:hr="t"/>
+        </w:pict>
+      </w:r>
+    </w:p>
+    <w:bookmarkStart w:id="70" w:name="episode-1-nike-vs.-adidas-athletes"/>
+    <w:p>
+      <w:pPr>
+        <w:pStyle w:val="Heading3"/>
+      </w:pPr>
+      <w:r>
+        <w:t xml:space="preserve">EPISODE 1: NIKE VS. ADIDAS — Athletes</w:t>
+      </w:r>
+    </w:p>
+    <w:p>
+      <w:pPr>
+        <w:pStyle w:val="FirstParagraph"/>
+      </w:pPr>
+      <w:r>
+        <w:t xml:space="preserve">Why this matchup is compelling: This is the oldest rivalry in sports marketing, reimagined for the creator economy. Nike and Adidas have spent 50 years competing for the same athlete endorsements; now they are competing for creator athletes who may never play in the Olympics but whose audiences are more engaged than any broadcast sports property. The draft pool is drawn from athletic creators — D1 college athletes, semi-professional sports players, fitness creators, sports commentators, and NIL-eligible athletes. The fundamental tension is philosophical: Nike’s brand voice is aspirational and individual (</w:t>
+      </w:r>
+      <w:r>
+        <w:t xml:space="preserve">“Just Do It”</w:t>
+      </w:r>
+      <w:r>
+        <w:t xml:space="preserve"> </w:t>
+      </w:r>
+      <w:r>
+        <w:t xml:space="preserve">— one athlete, one moment of greatness), while Adidas’s brand voice is community-oriented and collective (</w:t>
+      </w:r>
+      <w:r>
+        <w:t xml:space="preserve">“Impossible Is Nothing”</w:t>
+      </w:r>
+      <w:r>
+        <w:t xml:space="preserve"> </w:t>
+      </w:r>
+      <w:r>
+        <w:t xml:space="preserve">— achievement happens within a team, a culture, a world). Creators who are authentic individualists will score higher in Nike’s DealStage brief. Creators who are authentic community builders will score higher in Adidas’s brief. Some creators do not know which one they are until the draft forces the question.</w:t>
+      </w:r>
+    </w:p>
+    <w:p>
+      <w:pPr>
+        <w:pStyle w:val="BodyText"/>
+      </w:pPr>
+      <w:r>
+        <w:t xml:space="preserve">Predicted drama: The first pick of the season — the first creator selected in the first draft — will become the episode’s iconic moment. Both brands want the same creator. One will get them. The other will pivot in a direction nobody expected.</w:t>
+      </w:r>
+    </w:p>
+    <w:p>
+      <w:r>
+        <w:pict>
+          <v:rect style="width:0;height:1.5pt" o:hralign="center" o:hrstd="t" o:hr="t"/>
+        </w:pict>
+      </w:r>
+    </w:p>
+    <w:bookmarkEnd w:id="70"/>
+    <w:bookmarkStart w:id="71" w:name="Xc11860b9cd6d9272db9242bf64c35fb2c9b3931"/>
+    <w:p>
+      <w:pPr>
+        <w:pStyle w:val="Heading3"/>
+      </w:pPr>
+      <w:r>
+        <w:t xml:space="preserve">EPISODE 2: SPOTIFY VS. APPLE MUSIC — Musicians</w:t>
+      </w:r>
+    </w:p>
+    <w:p>
+      <w:pPr>
+        <w:pStyle w:val="FirstParagraph"/>
+      </w:pPr>
+      <w:r>
+        <w:t xml:space="preserve">Why this matchup is compelling: Spotify and Apple Music represent two fundamentally different philosophies about what music streaming is for. Spotify is a discovery platform — it believes music should find new listeners it has never had. Apple Music is a prestige platform — it believes in celebrating the music that already matters to people who take music seriously. These different philosophies produce different creator briefs: Spotify wants creators who introduce their audience to music they do not already know, while Apple Music wants creators who deepen their audience’s relationship with music they love. The draft pool is independent musicians, music journalists, music educators, and playlist-focused lifestyle creators. The hardest part of this episode is that the right answer is genuinely uncertain — some creators are both discovery-oriented and prestige-aligned, and the DealStage AI’s score for the same creator against two different briefs may be unexpectedly close.</w:t>
+      </w:r>
+    </w:p>
+    <w:p>
+      <w:pPr>
+        <w:pStyle w:val="BodyText"/>
+      </w:pPr>
+      <w:r>
+        <w:t xml:space="preserve">Predicted drama: An independent musician who is signed to neither platform as an artist is selected by both brands simultaneously in a draft conflict — a scenario the rules have not anticipated. The brands must negotiate in real time over a creator who is sitting in the room watching them fight over her.</w:t>
+      </w:r>
+    </w:p>
+    <w:p>
+      <w:r>
+        <w:pict>
+          <v:rect style="width:0;height:1.5pt" o:hralign="center" o:hrstd="t" o:hr="t"/>
+        </w:pict>
+      </w:r>
+    </w:p>
+    <w:bookmarkEnd w:id="71"/>
+    <w:bookmarkStart w:id="72" w:name="X898b4e11c11c1a8d9cd20d5ec5430392bd0a18d"/>
+    <w:p>
+      <w:pPr>
+        <w:pStyle w:val="Heading3"/>
+      </w:pPr>
+      <w:r>
+        <w:t xml:space="preserve">EPISODE 3: L’OREAL VS. ESTEE LAUDER — Beauty Creators</w:t>
+      </w:r>
+    </w:p>
+    <w:p>
+      <w:pPr>
+        <w:pStyle w:val="FirstParagraph"/>
+      </w:pPr>
+      <w:r>
+        <w:t xml:space="preserve">Why this matchup is compelling: L’Oreal and Estee Lauder are the two largest beauty conglomerates in the world, representing different points on the accessibility-to-luxury spectrum. L’Oreal’s brand promise is democratization —</w:t>
+      </w:r>
+      <w:r>
+        <w:t xml:space="preserve"> </w:t>
+      </w:r>
+      <w:r>
+        <w:t xml:space="preserve">“Because You’re Worth It”</w:t>
+      </w:r>
+      <w:r>
+        <w:t xml:space="preserve"> </w:t>
+      </w:r>
+      <w:r>
+        <w:t xml:space="preserve">is a statement about universal deserving, not exclusive access. Estee Lauder’s brand promise is aspiration — you are buying into something elevated. These different brand positions create different creator alignment criteria: L’Oreal needs creators whose audiences are diverse in income, background, and beauty philosophy; Estee Lauder needs creators whose audiences have the purchasing power and brand affinity to justify premium beauty investment. The draft pool spans all beauty creator categories — skincare educators, makeup artists, clean beauty advocates, inclusive beauty creators, and luxury lifestyle creators.</w:t>
+      </w:r>
+    </w:p>
+    <w:p>
+      <w:pPr>
+        <w:pStyle w:val="BodyText"/>
+      </w:pPr>
+      <w:r>
+        <w:t xml:space="preserve">Predicted drama: A creator who has built her entire platform around accessible, drugstore-beauty content scores unexpectedly high against the Estee Lauder brief because her audience’s aspiration metrics — what they want to buy, not what they currently buy — align with luxury positioning. Her DealStage score forces both brands to reconsider their assumptions about who belongs in their campaigns.</w:t>
+      </w:r>
+    </w:p>
+    <w:p>
+      <w:r>
+        <w:pict>
+          <v:rect style="width:0;height:1.5pt" o:hralign="center" o:hrstd="t" o:hr="t"/>
+        </w:pict>
+      </w:r>
+    </w:p>
+    <w:bookmarkEnd w:id="72"/>
+    <w:bookmarkStart w:id="73" w:name="X92fa3ab46109df03866851796ba73527c5bfe00"/>
+    <w:p>
+      <w:pPr>
+        <w:pStyle w:val="Heading3"/>
+      </w:pPr>
+      <w:r>
+        <w:t xml:space="preserve">EPISODE 4: NETFLIX VS. AMAZON PRIME — Entertainment Creators</w:t>
+      </w:r>
+    </w:p>
+    <w:p>
+      <w:pPr>
+        <w:pStyle w:val="FirstParagraph"/>
+      </w:pPr>
+      <w:r>
+        <w:t xml:space="preserve">Why this matchup is compelling: Netflix and Amazon Prime are the two largest streaming platforms in the world, and their creator partnership strategies are mirror images of each other. Netflix’s brand identity is built on cultural conversation — it wants creators who make their shows part of the cultural moment, who drive the kind of word-of-mouth that makes</w:t>
+      </w:r>
+      <w:r>
+        <w:t xml:space="preserve"> </w:t>
+      </w:r>
+      <w:r>
+        <w:t xml:space="preserve">“have you watched this?”</w:t>
+      </w:r>
+      <w:r>
+        <w:t xml:space="preserve"> </w:t>
+      </w:r>
+      <w:r>
+        <w:t xml:space="preserve">a social ritual. Amazon Prime’s brand identity is built on convenience and comprehensiveness — it wants creators who can credibly represent the totality of the Prime ecosystem (video, music, shopping, same-day delivery) as a lifestyle infrastructure, not just a streaming service. The draft pool includes entertainment content creators, pop culture commentators, film and TV reviewers, and lifestyle creators with strong content consumption habits visible in their audience data.</w:t>
+      </w:r>
+    </w:p>
+    <w:p>
+      <w:pPr>
+        <w:pStyle w:val="BodyText"/>
+      </w:pPr>
+      <w:r>
+        <w:t xml:space="preserve">Predicted drama: A gaming streamer — a creator who does not appear to belong in an entertainment brand matchup at all — scores highest against Amazon Prime’s brief because his audience’s purchase data (available through the DealStage platform’s behavioral insights module) shows they are Prime members at a 71% rate who use the full Prime ecosystem daily. Amazon selects him first. Netflix’s team is visibly confused. The creator himself cannot believe it.</w:t>
+      </w:r>
+    </w:p>
+    <w:p>
+      <w:r>
+        <w:pict>
+          <v:rect style="width:0;height:1.5pt" o:hralign="center" o:hrstd="t" o:hr="t"/>
+        </w:pict>
+      </w:r>
+    </w:p>
+    <w:bookmarkEnd w:id="73"/>
+    <w:bookmarkStart w:id="74" w:name="X1dcc77dd4832d1f87136c33d3020b66b2f8dc98"/>
+    <w:p>
+      <w:pPr>
+        <w:pStyle w:val="Heading3"/>
+      </w:pPr>
+      <w:r>
+        <w:t xml:space="preserve">EPISODE 5: RED BULL VS. MONSTER — Extreme Sports Creators</w:t>
+      </w:r>
+    </w:p>
+    <w:p>
+      <w:pPr>
+        <w:pStyle w:val="FirstParagraph"/>
+      </w:pPr>
+      <w:r>
+        <w:t xml:space="preserve">Why this matchup is compelling: Red Bull and Monster are the two dominant energy drink brands in the creator economy’s extreme sports category, but their creator partnership philosophies are radically different. Red Bull is a media company that happens to sell energy drinks — its creator partnerships are designed to tell stories about human achievement at the extreme edge of possibility, regardless of whether the creator drinks Red Bull. Monster is a product company that values creator authenticity above all — it wants creators who genuinely drink Monster, who show up on camera with a can because that is what they actually do, not because the contract requires it. The draft pool includes extreme sports athletes, action sports creators, outdoor adventure creators, and the growing category of</w:t>
+      </w:r>
+      <w:r>
+        <w:t xml:space="preserve"> </w:t>
+      </w:r>
+      <w:r>
+        <w:t xml:space="preserve">“extreme ordinary”</w:t>
+      </w:r>
+      <w:r>
+        <w:t xml:space="preserve"> </w:t>
+      </w:r>
+      <w:r>
+        <w:t xml:space="preserve">creators — people whose content involves extraordinary effort applied to non-traditional contexts.</w:t>
+      </w:r>
+    </w:p>
+    <w:p>
+      <w:pPr>
+        <w:pStyle w:val="BodyText"/>
+      </w:pPr>
+      <w:r>
+        <w:t xml:space="preserve">Predicted drama: The brands’ philosophies create a fascinating split: Red Bull’s picks tend to be the most visually spectacular creators regardless of their product relationship, while Monster’s picks tend to be less visually impressive but more authentically product-integrated. Midway through the episode, a Red Bull-selected creator reveals in a confessional that he personally hates energy drinks and never consumes them. Red Bull’s brand manager, watching the reveal, has to decide whether authenticity matters more than aesthetics.</w:t>
+      </w:r>
+    </w:p>
+    <w:p>
+      <w:r>
+        <w:pict>
+          <v:rect style="width:0;height:1.5pt" o:hralign="center" o:hrstd="t" o:hr="t"/>
+        </w:pict>
+      </w:r>
+    </w:p>
+    <w:bookmarkEnd w:id="74"/>
+    <w:bookmarkStart w:id="75" w:name="Xe1da71c2f0b061da1e082b3fa6ba5a574575818"/>
+    <w:p>
+      <w:pPr>
+        <w:pStyle w:val="Heading3"/>
+      </w:pPr>
+      <w:r>
+        <w:t xml:space="preserve">EPISODE 6: PELOTON VS. LULULEMON — Fitness Creators</w:t>
+      </w:r>
+    </w:p>
+    <w:p>
+      <w:pPr>
+        <w:pStyle w:val="FirstParagraph"/>
+      </w:pPr>
+      <w:r>
+        <w:t xml:space="preserve">Why this matchup is compelling: Peloton and Lululemon represent two different relationships to the fitness lifestyle. Peloton sells equipment and community — the Peloton experience is fundamentally about accountability, measurement, and the social motivation of shared effort. Lululemon sells aspiration and identity — wearing Lululemon is a statement about who you are and how you move through the world, whether or not you ever set foot in a studio. These different brand philosophies create genuinely different creator alignment criteria: Peloton needs creators who can communicate the emotional experience of consistent fitness practice; Lululemon needs creators whose visual identity and lifestyle aspiration already live in the premium fitness aesthetic. Some creators have both. Most have one more than the other.</w:t>
+      </w:r>
+    </w:p>
+    <w:p>
+      <w:pPr>
+        <w:pStyle w:val="BodyText"/>
+      </w:pPr>
+      <w:r>
+        <w:t xml:space="preserve">Predicted drama: A creator who has built her platform entirely around anti-diet culture and joyful movement — content that explicitly rejects the</w:t>
+      </w:r>
+      <w:r>
+        <w:t xml:space="preserve"> </w:t>
+      </w:r>
+      <w:r>
+        <w:t xml:space="preserve">“performance”</w:t>
+      </w:r>
+      <w:r>
+        <w:t xml:space="preserve"> </w:t>
+      </w:r>
+      <w:r>
+        <w:t xml:space="preserve">aesthetic of premium fitness brands — scores surprisingly high against both Peloton and Lululemon because her audience’s engagement data shows they are more interested in purchasing fitness products than the aesthetic of her content suggests. The data and the creator’s self-perception are in direct conflict, and she has to decide which one to trust.</w:t>
+      </w:r>
+    </w:p>
+    <w:p>
+      <w:r>
+        <w:pict>
+          <v:rect style="width:0;height:1.5pt" o:hralign="center" o:hrstd="t" o:hr="t"/>
+        </w:pict>
+      </w:r>
+    </w:p>
+    <w:bookmarkEnd w:id="75"/>
+    <w:bookmarkStart w:id="76" w:name="Xaec449e8db580020fa4b47a7413b7fde29a8574"/>
+    <w:p>
+      <w:pPr>
+        <w:pStyle w:val="Heading3"/>
+      </w:pPr>
+      <w:r>
+        <w:t xml:space="preserve">EPISODE 7: MARRIOTT VS. HILTON — Travel Creators</w:t>
+      </w:r>
+    </w:p>
+    <w:p>
+      <w:pPr>
+        <w:pStyle w:val="FirstParagraph"/>
+      </w:pPr>
+      <w:r>
+        <w:t xml:space="preserve">Why this matchup is compelling: Marriott and Hilton are the world’s two largest hotel companies, competing for the same global traveler with slightly different brand propositions. Marriott leads with portfolio breadth — from budget to ultra-luxury, from boutique to convention hotel, Marriott is the hotel company for every version of travel. Hilton leads with loyalty program strength — Hilton Honors is among the most generous loyalty programs in hospitality, and Hilton’s creator briefs emphasize the emotional relationship between the traveler and the accumulation of points, status, and belonging. The draft pool includes travel creators, digital nomads, luxury lifestyle creators, business travel content creators, and adventure travel photographers.</w:t>
+      </w:r>
+    </w:p>
+    <w:p>
+      <w:pPr>
+        <w:pStyle w:val="BodyText"/>
+      </w:pPr>
+      <w:r>
+        <w:t xml:space="preserve">Predicted drama: A travel creator based in Southeast Asia who has built her entire platform around budget travel and backpacker culture is selected by both brands in the same draft round — creating a conflict neither brand expected. Both brands argue that their brief can work with her audience. The DealStage AI’s score for her is identical (within 2 points) against both briefs. The tiebreaker is decided not by data but by a 90-second live pitch from each brand’s representative to the creator herself, arguing why she belongs with their brand. It is the only moment in the season where the creator chooses the brand rather than the brand choosing the creator.</w:t>
+      </w:r>
+    </w:p>
+    <w:p>
+      <w:r>
+        <w:pict>
+          <v:rect style="width:0;height:1.5pt" o:hralign="center" o:hrstd="t" o:hr="t"/>
+        </w:pict>
+      </w:r>
+    </w:p>
+    <w:bookmarkEnd w:id="76"/>
+    <w:bookmarkStart w:id="77" w:name="Xdac0d65ad73ca34eb8a40ba06f8e0f6ac5c39ba"/>
+    <w:p>
+      <w:pPr>
+        <w:pStyle w:val="Heading3"/>
+      </w:pPr>
+      <w:r>
+        <w:t xml:space="preserve">EPISODE 8: SAMSUNG VS. APPLE — Tech Creators</w:t>
+      </w:r>
+    </w:p>
+    <w:p>
+      <w:pPr>
+        <w:pStyle w:val="FirstParagraph"/>
+      </w:pPr>
+      <w:r>
+        <w:t xml:space="preserve">Why this matchup is compelling: Samsung and Apple are the world’s two most valuable consumer electronics brands, and their creator partnership strategies illuminate everything different about them. Apple’s brand is about design philosophy, ecosystem integration, and the user who cares about how technology feels. Samsung’s brand is about feature innovation, price accessibility, and the user who wants the most technology for their investment. These philosophies produce radically different creator alignment criteria — and in a format where both brands are in the room simultaneously, the contrast between</w:t>
+      </w:r>
+      <w:r>
+        <w:t xml:space="preserve"> </w:t>
+      </w:r>
+      <w:r>
+        <w:t xml:space="preserve">“Apple person”</w:t>
+      </w:r>
+      <w:r>
+        <w:t xml:space="preserve"> </w:t>
+      </w:r>
+      <w:r>
+        <w:t xml:space="preserve">and</w:t>
+      </w:r>
+      <w:r>
+        <w:t xml:space="preserve"> </w:t>
+      </w:r>
+      <w:r>
+        <w:t xml:space="preserve">“Samsung person”</w:t>
+      </w:r>
+      <w:r>
+        <w:t xml:space="preserve"> </w:t>
+      </w:r>
+      <w:r>
+        <w:t xml:space="preserve">becomes visible, discussable, and often surprising. The draft pool includes tech reviewers, lifestyle creators who integrate technology naturally into their content, productivity creators, and mobile photography specialists.</w:t>
+      </w:r>
+    </w:p>
+    <w:p>
+      <w:pPr>
+        <w:pStyle w:val="BodyText"/>
+      </w:pPr>
+      <w:r>
+        <w:t xml:space="preserve">Predicted drama: A creator who has been a publicly self-identified</w:t>
+      </w:r>
+      <w:r>
+        <w:t xml:space="preserve"> </w:t>
+      </w:r>
+      <w:r>
+        <w:t xml:space="preserve">“Apple person”</w:t>
+      </w:r>
+      <w:r>
+        <w:t xml:space="preserve"> </w:t>
+      </w:r>
+      <w:r>
+        <w:t xml:space="preserve">for her entire platform career — she films exclusively on iPhone, edits on MacBook, and has her AirPods in every video — scores higher against the Samsung brief than the Apple brief. The DealStage AI has found something in her audience data that neither she nor Apple’s team expected: her followers are 64% Android users who follow her aspirationally, not because they share her product preferences. Samsung drafts her first. Apple’s team does not take it well.</w:t>
+      </w:r>
+    </w:p>
+    <w:p>
+      <w:r>
+        <w:pict>
+          <v:rect style="width:0;height:1.5pt" o:hralign="center" o:hrstd="t" o:hr="t"/>
+        </w:pict>
+      </w:r>
+    </w:p>
+    <w:bookmarkEnd w:id="77"/>
+    <w:bookmarkStart w:id="78" w:name="Xa96ed4f82c3f366d41d0c2bf30d3ecf741c9ea0"/>
+    <w:p>
+      <w:pPr>
+        <w:pStyle w:val="Heading3"/>
+      </w:pPr>
+      <w:r>
+        <w:t xml:space="preserve">EPISODE 9: COCA-COLA VS. PEPSI — Food and Lifestyle Creators</w:t>
+      </w:r>
+    </w:p>
+    <w:p>
+      <w:pPr>
+        <w:pStyle w:val="FirstParagraph"/>
+      </w:pPr>
+      <w:r>
+        <w:t xml:space="preserve">Why this matchup is compelling: The Coca-Cola vs. Pepsi rivalry is the oldest consumer brand competition in American marketing history, and its creator economy translation is fascinating because neither brand is primarily competing on product at this stage — they are competing on cultural relevance. Coca-Cola’s brand identity is emotional nostalgia and universal belonging (</w:t>
+      </w:r>
+      <w:r>
+        <w:t xml:space="preserve">“Share a Coke,”</w:t>
+      </w:r>
+      <w:r>
+        <w:t xml:space="preserve"> </w:t>
+      </w:r>
+      <w:r>
+        <w:t xml:space="preserve">the red can, the polar bear, the holidays). Pepsi’s brand identity is youthful challenge and cultural edge (</w:t>
+      </w:r>
+      <w:r>
+        <w:t xml:space="preserve">“Is Pepsi OK?”</w:t>
+      </w:r>
+      <w:r>
+        <w:t xml:space="preserve"> </w:t>
+      </w:r>
+      <w:r>
+        <w:t xml:space="preserve">— an entire campaign built on the brand’s underdog status relative to Coke). The creator briefs reflect these positions: Coca-Cola needs creators who can make their audience feel the warmth of a shared human moment; Pepsi needs creators who make their audience feel like they are in on something that the mainstream has not discovered yet.</w:t>
+      </w:r>
+    </w:p>
+    <w:p>
+      <w:pPr>
+        <w:pStyle w:val="BodyText"/>
+      </w:pPr>
+      <w:r>
+        <w:t xml:space="preserve">Predicted drama: The episode’s central conflict is cultural — both brands need creators who can operate in the food and lifestyle space without being so</w:t>
+      </w:r>
+      <w:r>
+        <w:t xml:space="preserve"> </w:t>
+      </w:r>
+      <w:r>
+        <w:t xml:space="preserve">“food-specific”</w:t>
+      </w:r>
+      <w:r>
+        <w:t xml:space="preserve"> </w:t>
+      </w:r>
+      <w:r>
+        <w:t xml:space="preserve">that the beverage integration feels forced. The draft pool includes food creators, lifestyle creators, family creators, and the somewhat ambiguous category of</w:t>
+      </w:r>
+      <w:r>
+        <w:t xml:space="preserve"> </w:t>
+      </w:r>
+      <w:r>
+        <w:t xml:space="preserve">“social occasion”</w:t>
+      </w:r>
+      <w:r>
+        <w:t xml:space="preserve"> </w:t>
+      </w:r>
+      <w:r>
+        <w:t xml:space="preserve">creators (people who document celebrations, gatherings, and shared meals rather than food specifically). The Pepsi team makes a counter-intuitive pick: a meme creator whose content has nothing to do with food, but whose audience skews perfectly toward Pepsi’s 16–24 demographic and who has demonstrated product humor integration in three previous campaigns. Coca-Cola responds by drafting the most emotionally resonant creator in the pool — a family creator whose Thanksgiving content has averaged 4M views for three consecutive years.</w:t>
+      </w:r>
+    </w:p>
+    <w:p>
+      <w:r>
+        <w:pict>
+          <v:rect style="width:0;height:1.5pt" o:hralign="center" o:hrstd="t" o:hr="t"/>
+        </w:pict>
+      </w:r>
+    </w:p>
+    <w:bookmarkEnd w:id="78"/>
+    <w:bookmarkStart w:id="79" w:name="Xc49c240e5256939e13ddc2afb9f1769b7176b93"/>
+    <w:p>
+      <w:pPr>
+        <w:pStyle w:val="Heading3"/>
+      </w:pPr>
+      <w:r>
+        <w:t xml:space="preserve">EPISODE 10: ALL-STAR FINALE — Top Brands from the Season Compete</w:t>
+      </w:r>
+    </w:p>
+    <w:p>
+      <w:pPr>
+        <w:pStyle w:val="FirstParagraph"/>
+      </w:pPr>
+      <w:r>
+        <w:t xml:space="preserve">Format: The five brands with the highest-performing creator campaigns from episodes 1–9 return for a single champion matchup. They do not compete against each other directly — they each get one final creator selection from a combined</w:t>
+      </w:r>
+      <w:r>
+        <w:t xml:space="preserve"> </w:t>
+      </w:r>
+      <w:r>
+        <w:t xml:space="preserve">“all-star”</w:t>
+      </w:r>
+      <w:r>
+        <w:t xml:space="preserve"> </w:t>
+      </w:r>
+      <w:r>
+        <w:t xml:space="preserve">pool of the season’s best-performing creators. The goal is not to win against other brands; it is to maximize their own campaign performance as measured by the DealStage platform at 60 days post-campaign.</w:t>
+      </w:r>
+    </w:p>
+    <w:p>
+      <w:pPr>
+        <w:pStyle w:val="BodyText"/>
+      </w:pPr>
+      <w:r>
+        <w:t xml:space="preserve">The all-star pool: 15 creators — the top-performing creator from each of the season’s 10 episodes, plus 5 wildcard creators who were not selected in any previous episode. This means some of the most desirable creators in the pool were passed over all season, and the brands that know the data will understand why they were undervalued.</w:t>
+      </w:r>
+    </w:p>
+    <w:p>
+      <w:pPr>
+        <w:pStyle w:val="BodyText"/>
+      </w:pPr>
+      <w:r>
+        <w:t xml:space="preserve">The finale’s central question is retrospective: given everything we now know about what makes a creator-brand match work, would these brands have made the same picks they did in episode 1? The DealStage platform can actually answer this — it runs a simulation at the end of the season showing what the optimal draft picks would have been, and compares them to what the brands actually chose. The gap between optimal and actual is the show’s most honest data moment.</w:t>
+      </w:r>
+    </w:p>
+    <w:p>
+      <w:r>
+        <w:pict>
+          <v:rect style="width:0;height:1.5pt" o:hralign="center" o:hrstd="t" o:hr="t"/>
+        </w:pict>
+      </w:r>
+    </w:p>
+    <w:p>
+      <w:r>
+        <w:pict>
+          <v:rect style="width:0;height:1.5pt" o:hralign="center" o:hrstd="t" o:hr="t"/>
+        </w:pict>
+      </w:r>
+    </w:p>
+    <w:bookmarkEnd w:id="79"/>
+    <w:bookmarkEnd w:id="80"/>
+    <w:bookmarkStart w:id="86" w:name="the-draft-mechanics-detailed-rules"/>
+    <w:p>
+      <w:pPr>
+        <w:pStyle w:val="Heading2"/>
+      </w:pPr>
+      <w:r>
+        <w:t xml:space="preserve">THE DRAFT MECHANICS — DETAILED RULES</w:t>
+      </w:r>
+    </w:p>
+    <w:p>
+      <w:r>
+        <w:pict>
+          <v:rect style="width:0;height:1.5pt" o:hralign="center" o:hrstd="t" o:hr="t"/>
+        </w:pict>
+      </w:r>
+    </w:p>
+    <w:bookmarkStart w:id="81" w:name="snake-draft-format"/>
+    <w:p>
+      <w:pPr>
+        <w:pStyle w:val="Heading3"/>
+      </w:pPr>
+      <w:r>
+        <w:t xml:space="preserve">SNAKE DRAFT FORMAT</w:t>
+      </w:r>
+    </w:p>
+    <w:p>
+      <w:pPr>
+        <w:pStyle w:val="FirstParagraph"/>
+      </w:pPr>
+      <w:r>
+        <w:t xml:space="preserve">Brand vs. Brand uses a snake draft — the same format used in fantasy sports drafts — to ensure both brands have equal access to the creator pool across all rounds.</w:t>
+      </w:r>
+    </w:p>
+    <w:p>
+      <w:pPr>
+        <w:pStyle w:val="BodyText"/>
+      </w:pPr>
+      <w:r>
+        <w:t xml:space="preserve">How it works: In round 1, Brand A picks first and Brand B picks second. In round 2, Brand B picks first and Brand A picks second. The pattern alternates each round, ensuring that neither brand has a consistent positional advantage. In a 5-round draft (producing a roster of 5 creators per brand), the picking order is: A, B — B, A — A, B — B, A — A, B.</w:t>
+      </w:r>
+    </w:p>
+    <w:p>
+      <w:pPr>
+        <w:pStyle w:val="BodyText"/>
+      </w:pPr>
+      <w:r>
+        <w:t xml:space="preserve">Why snake format specifically: The snake draft produces richer strategic decisions than a standard alternating draft because a brand that holds the last pick in one round and the first pick in the next round (picks 5 and 6 in a 10-pick draft) faces a specific strategic question: is the creator available at pick 5 worth taking now, or is the field at pick 6 deeper? This decision — which fantasy sports players have agonized over for decades — translates perfectly to the brand side, where the equivalent question is: do we take the best available creator right now, or do we wait for the specific creator type we actually need?</w:t>
+      </w:r>
+    </w:p>
+    <w:p>
+      <w:r>
+        <w:pict>
+          <v:rect style="width:0;height:1.5pt" o:hralign="center" o:hrstd="t" o:hr="t"/>
+        </w:pict>
+      </w:r>
+    </w:p>
+    <w:bookmarkEnd w:id="81"/>
+    <w:bookmarkStart w:id="82" w:name="trade-rules-and-procedures"/>
+    <w:p>
+      <w:pPr>
+        <w:pStyle w:val="Heading3"/>
+      </w:pPr>
+      <w:r>
+        <w:t xml:space="preserve">TRADE RULES AND PROCEDURES</w:t>
+      </w:r>
+    </w:p>
+    <w:p>
+      <w:pPr>
+        <w:pStyle w:val="FirstParagraph"/>
+      </w:pPr>
+      <w:r>
+        <w:t xml:space="preserve">Beginning in round 3, brands may propose trades — exchanging an already-drafted creator for a different creator on the opposing brand’s roster, with or without additional compensation (additional brand budget, favorable rights terms, or a future pick in the following season’s draft).</w:t>
+      </w:r>
+    </w:p>
+    <w:p>
+      <w:pPr>
+        <w:pStyle w:val="BodyText"/>
+      </w:pPr>
+      <w:r>
+        <w:t xml:space="preserve">Trade rules:</w:t>
+      </w:r>
+      <w:r>
+        <w:t xml:space="preserve"> </w:t>
+      </w:r>
+      <w:r>
+        <w:t xml:space="preserve">- Trades may only be proposed between picks, not during a pick window</w:t>
+      </w:r>
+      <w:r>
+        <w:t xml:space="preserve"> </w:t>
+      </w:r>
+      <w:r>
+        <w:t xml:space="preserve">- The creator being traded must consent — a 60-second consent window is given after each proposed trade</w:t>
+      </w:r>
+      <w:r>
+        <w:t xml:space="preserve"> </w:t>
+      </w:r>
+      <w:r>
+        <w:t xml:space="preserve">- If the creator declines the trade, the deal is void and cannot be proposed again in the same episode</w:t>
+      </w:r>
+      <w:r>
+        <w:t xml:space="preserve"> </w:t>
+      </w:r>
+      <w:r>
+        <w:t xml:space="preserve">- Trades that include</w:t>
+      </w:r>
+      <w:r>
+        <w:t xml:space="preserve"> </w:t>
+      </w:r>
+      <w:r>
+        <w:t xml:space="preserve">“future picks”</w:t>
+      </w:r>
+      <w:r>
+        <w:t xml:space="preserve"> </w:t>
+      </w:r>
+      <w:r>
+        <w:t xml:space="preserve">must be approved by the show’s production team (to prevent strategy that undermines season narrative continuity)</w:t>
+      </w:r>
+      <w:r>
+        <w:t xml:space="preserve"> </w:t>
+      </w:r>
+      <w:r>
+        <w:t xml:space="preserve">- A maximum of two trades per brand per episode</w:t>
+      </w:r>
+    </w:p>
+    <w:p>
+      <w:pPr>
+        <w:pStyle w:val="BodyText"/>
+      </w:pPr>
+      <w:r>
+        <w:t xml:space="preserve">Trade strategy insight: Trades are most valuable when one brand has a roster surplus in a specific category and the other brand has a deficit. A brand that has drafted three fitness creators and one beauty creator might trade the third fitness creator for a lifestyle creator that better completes their campaign portfolio. The DealStage AI can model the post-trade portfolio performance for both brands in real time — and the audience sees the simulation before the trade is accepted.</w:t>
+      </w:r>
+    </w:p>
+    <w:p>
+      <w:r>
+        <w:pict>
+          <v:rect style="width:0;height:1.5pt" o:hralign="center" o:hrstd="t" o:hr="t"/>
+        </w:pict>
+      </w:r>
+    </w:p>
+    <w:bookmarkEnd w:id="82"/>
+    <w:bookmarkStart w:id="83" w:name="the-steal-one-per-episode"/>
+    <w:p>
+      <w:pPr>
+        <w:pStyle w:val="Heading3"/>
+      </w:pPr>
+      <w:r>
+        <w:t xml:space="preserve">“THE STEAL”</w:t>
+      </w:r>
+      <w:r>
+        <w:t xml:space="preserve"> </w:t>
+      </w:r>
+      <w:r>
+        <w:t xml:space="preserve">— ONE PER EPISODE</w:t>
+      </w:r>
+    </w:p>
+    <w:p>
+      <w:pPr>
+        <w:pStyle w:val="FirstParagraph"/>
+      </w:pPr>
+      <w:r>
+        <w:t xml:space="preserve">Once per episode, each brand may activate</w:t>
+      </w:r>
+      <w:r>
+        <w:t xml:space="preserve"> </w:t>
+      </w:r>
+      <w:r>
+        <w:t xml:space="preserve">“The Steal”</w:t>
+      </w:r>
+      <w:r>
+        <w:t xml:space="preserve"> </w:t>
+      </w:r>
+      <w:r>
+        <w:t xml:space="preserve">— overriding the snake draft order to take a creator that the other brand has already selected. The brand activating The Steal must pay a</w:t>
+      </w:r>
+      <w:r>
+        <w:t xml:space="preserve"> </w:t>
+      </w:r>
+      <w:r>
+        <w:t xml:space="preserve">“steal penalty”</w:t>
+      </w:r>
+      <w:r>
+        <w:t xml:space="preserve"> </w:t>
+      </w:r>
+      <w:r>
+        <w:t xml:space="preserve">— an additional 15% of the standard budget allocation for that creator, representing the competitive premium for forcing a top selection.</w:t>
+      </w:r>
+    </w:p>
+    <w:p>
+      <w:pPr>
+        <w:pStyle w:val="BodyText"/>
+      </w:pPr>
+      <w:r>
+        <w:t xml:space="preserve">Rules:</w:t>
+      </w:r>
+      <w:r>
+        <w:t xml:space="preserve"> </w:t>
+      </w:r>
+      <w:r>
+        <w:t xml:space="preserve">- The Steal may only be used after round 2 (no stealing in the first two rounds)</w:t>
+      </w:r>
+      <w:r>
+        <w:t xml:space="preserve"> </w:t>
+      </w:r>
+      <w:r>
+        <w:t xml:space="preserve">- A stolen creator cannot be stolen again in the same episode</w:t>
+      </w:r>
+      <w:r>
+        <w:t xml:space="preserve"> </w:t>
+      </w:r>
+      <w:r>
+        <w:t xml:space="preserve">- The brand whose creator was stolen gets an extra pick at the end of the next round</w:t>
+      </w:r>
+      <w:r>
+        <w:t xml:space="preserve"> </w:t>
+      </w:r>
+      <w:r>
+        <w:t xml:space="preserve">- The Steal must be activated before the opposing brand’s pick clock expires — it cannot be retroactive</w:t>
+      </w:r>
+    </w:p>
+    <w:p>
+      <w:pPr>
+        <w:pStyle w:val="BodyText"/>
+      </w:pPr>
+      <w:r>
+        <w:t xml:space="preserve">Why The Steal creates great television: The Steal is a declaration of war. When a brand activates it, they are saying publicly: that creator belongs with us, not with them. The opposing brand’s reaction — and the creator’s reaction, watching two brands argue over them — produces the most emotionally raw moments of any episode. The creator is not a passive object in The Steal; they know it is happening in real time and they have a 60-second window to accept or reject the trade. A creator who rejects The Steal and chooses to stay with the original brand creates a moment that no scripted television can manufacture.</w:t>
+      </w:r>
+    </w:p>
+    <w:p>
+      <w:r>
+        <w:pict>
+          <v:rect style="width:0;height:1.5pt" o:hralign="center" o:hrstd="t" o:hr="t"/>
+        </w:pict>
+      </w:r>
+    </w:p>
+    <w:bookmarkEnd w:id="83"/>
+    <w:bookmarkStart w:id="84" w:name="roster-requirements"/>
+    <w:p>
+      <w:pPr>
+        <w:pStyle w:val="Heading3"/>
+      </w:pPr>
+      <w:r>
+        <w:t xml:space="preserve">ROSTER REQUIREMENTS</w:t>
+      </w:r>
+    </w:p>
+    <w:p>
+      <w:pPr>
+        <w:pStyle w:val="FirstParagraph"/>
+      </w:pPr>
+      <w:r>
+        <w:t xml:space="preserve">Each brand must finish each episode with a roster that meets the following minimum requirements:</w:t>
+      </w:r>
+    </w:p>
+    <w:p>
+      <w:pPr>
+        <w:pStyle w:val="Compact"/>
+        <w:numPr>
+          <w:ilvl w:val="0"/>
+          <w:numId w:val="1044"/>
+        </w:numPr>
+      </w:pPr>
+      <w:r>
+        <w:t xml:space="preserve">Minimum creators: 3 per brand per episode</w:t>
+      </w:r>
+    </w:p>
+    <w:p>
+      <w:pPr>
+        <w:pStyle w:val="Compact"/>
+        <w:numPr>
+          <w:ilvl w:val="0"/>
+          <w:numId w:val="1044"/>
+        </w:numPr>
+      </w:pPr>
+      <w:r>
+        <w:t xml:space="preserve">Maximum creators: 5 per brand per episode</w:t>
+      </w:r>
+    </w:p>
+    <w:p>
+      <w:pPr>
+        <w:pStyle w:val="Compact"/>
+        <w:numPr>
+          <w:ilvl w:val="0"/>
+          <w:numId w:val="1044"/>
+        </w:numPr>
+      </w:pPr>
+      <w:r>
+        <w:t xml:space="preserve">Category diversity: No more than 2 creators from the same primary content category (e.g., a brand cannot draft 3 fitness creators)</w:t>
+      </w:r>
+    </w:p>
+    <w:p>
+      <w:pPr>
+        <w:pStyle w:val="Compact"/>
+        <w:numPr>
+          <w:ilvl w:val="0"/>
+          <w:numId w:val="1044"/>
+        </w:numPr>
+      </w:pPr>
+      <w:r>
+        <w:t xml:space="preserve">Demographic coverage: The combined roster must cover at least 3 distinct audience demographic segments (age, gender, ethnicity, or geography)</w:t>
+      </w:r>
+    </w:p>
+    <w:p>
+      <w:pPr>
+        <w:pStyle w:val="FirstParagraph"/>
+      </w:pPr>
+      <w:r>
+        <w:t xml:space="preserve">Penalty for violations: A brand that violates roster requirements at the end of the draft phase must return one creator to the pool (of the production team’s choosing, not the brand’s choosing) and draft a replacement within 5 minutes, with no additional time for strategic deliberation.</w:t>
+      </w:r>
+    </w:p>
+    <w:p>
+      <w:r>
+        <w:pict>
+          <v:rect style="width:0;height:1.5pt" o:hralign="center" o:hrstd="t" o:hr="t"/>
+        </w:pict>
+      </w:r>
+    </w:p>
+    <w:bookmarkEnd w:id="84"/>
+    <w:bookmarkStart w:id="85" w:name="budget-constraints"/>
+    <w:p>
+      <w:pPr>
+        <w:pStyle w:val="Heading3"/>
+      </w:pPr>
+      <w:r>
+        <w:t xml:space="preserve">BUDGET CONSTRAINTS</w:t>
+      </w:r>
+    </w:p>
+    <w:p>
+      <w:pPr>
+        <w:pStyle w:val="FirstParagraph"/>
+      </w:pPr>
+      <w:r>
+        <w:t xml:space="preserve">Both brands receive the same total budget for each episode — a number set by the production team in partnership with the featured brands prior to filming. The budget covers all creator deal fees for the episode’s selected roster.</w:t>
+      </w:r>
+    </w:p>
+    <w:p>
+      <w:pPr>
+        <w:pStyle w:val="BodyText"/>
+      </w:pPr>
+      <w:r>
+        <w:t xml:space="preserve">Budget mechanics:</w:t>
+      </w:r>
+      <w:r>
+        <w:t xml:space="preserve"> </w:t>
+      </w:r>
+      <w:r>
+        <w:t xml:space="preserve">- The total budget is announced at the start of the episode — both brands know their maximum spend</w:t>
+      </w:r>
+      <w:r>
+        <w:t xml:space="preserve"> </w:t>
+      </w:r>
+      <w:r>
+        <w:t xml:space="preserve">- Creators are not assigned a fixed price; their value is negotiated within the draft</w:t>
+      </w:r>
+      <w:r>
+        <w:t xml:space="preserve"> </w:t>
+      </w:r>
+      <w:r>
+        <w:t xml:space="preserve">- If a brand</w:t>
+      </w:r>
+      <w:r>
+        <w:t xml:space="preserve"> </w:t>
+      </w:r>
+      <w:r>
+        <w:t xml:space="preserve">“overpays”</w:t>
+      </w:r>
+      <w:r>
+        <w:t xml:space="preserve"> </w:t>
+      </w:r>
+      <w:r>
+        <w:t xml:space="preserve">in early rounds, they have less budget for later rounds — creating natural trade-offs between top talent and roster depth</w:t>
+      </w:r>
+      <w:r>
+        <w:t xml:space="preserve"> </w:t>
+      </w:r>
+      <w:r>
+        <w:t xml:space="preserve">- The DealStage AI calculates expected campaign ROI for each brand’s full roster at the end of the draft, factoring in both the creator quality and the price paid</w:t>
+      </w:r>
+    </w:p>
+    <w:p>
+      <w:pPr>
+        <w:pStyle w:val="BodyText"/>
+      </w:pPr>
+      <w:r>
+        <w:t xml:space="preserve">Budget transparency: Both brands’ budget allocations are visible to the audience throughout the episode — displayed as a running</w:t>
+      </w:r>
+      <w:r>
+        <w:t xml:space="preserve"> </w:t>
+      </w:r>
+      <w:r>
+        <w:t xml:space="preserve">“war chest”</w:t>
+      </w:r>
+      <w:r>
+        <w:t xml:space="preserve"> </w:t>
+      </w:r>
+      <w:r>
+        <w:t xml:space="preserve">graphic. This creates second-screen commentary as viewers calculate in real time whether a brand is over-spending on a single creator or building a smarter portfolio.</w:t>
+      </w:r>
+    </w:p>
+    <w:p>
+      <w:r>
+        <w:pict>
+          <v:rect style="width:0;height:1.5pt" o:hralign="center" o:hrstd="t" o:hr="t"/>
+        </w:pict>
+      </w:r>
+    </w:p>
+    <w:p>
+      <w:r>
+        <w:pict>
+          <v:rect style="width:0;height:1.5pt" o:hralign="center" o:hrstd="t" o:hr="t"/>
+        </w:pict>
+      </w:r>
+    </w:p>
+    <w:bookmarkEnd w:id="85"/>
+    <w:bookmarkEnd w:id="86"/>
+    <w:bookmarkStart w:id="92" w:name="X44ca38b5686eb736fe2bf589a52cc1f7ecb71f2"/>
+    <w:p>
+      <w:pPr>
+        <w:pStyle w:val="Heading2"/>
+      </w:pPr>
+      <w:r>
+        <w:t xml:space="preserve">SUGGESTIONS FOR THE BRAND VS. BRAND FORMAT</w:t>
+      </w:r>
+    </w:p>
+    <w:p>
+      <w:r>
+        <w:pict>
+          <v:rect style="width:0;height:1.5pt" o:hralign="center" o:hrstd="t" o:hr="t"/>
+        </w:pict>
+      </w:r>
+    </w:p>
+    <w:bookmarkStart w:id="87" w:name="X02541447d8d58f423a9376a59c553a3658c1fa8"/>
+    <w:p>
+      <w:pPr>
+        <w:pStyle w:val="Heading3"/>
+      </w:pPr>
+      <w:r>
+        <w:t xml:space="preserve">SUGGESTION 1:</w:t>
+      </w:r>
+      <w:r>
+        <w:t xml:space="preserve"> </w:t>
+      </w:r>
+      <w:r>
+        <w:t xml:space="preserve">“BATTLE OF THE AGENCIES”</w:t>
+      </w:r>
+      <w:r>
+        <w:t xml:space="preserve"> </w:t>
+      </w:r>
+      <w:r>
+        <w:t xml:space="preserve">VARIANT</w:t>
+      </w:r>
+    </w:p>
+    <w:p>
+      <w:pPr>
+        <w:pStyle w:val="FirstParagraph"/>
+      </w:pPr>
+      <w:r>
+        <w:t xml:space="preserve">Replace the two competing brands with two competing talent management agencies. Instead of brands drafting creators, agencies draft brands — selecting which brand partnerships they want to secure for their pre-set creator roster. This reversal of the format creates a fundamentally different dynamic: the agencies know their talent, the brands are the variable, and the strategic challenge is matching brand opportunities to creator strengths rather than matching creator profiles to brand needs.</w:t>
+      </w:r>
+    </w:p>
+    <w:p>
+      <w:pPr>
+        <w:pStyle w:val="BodyText"/>
+      </w:pPr>
+      <w:r>
+        <w:t xml:space="preserve">This variant is the most accessible to agencies who watch The Agency (Concept C) and want to see their own strategic decision-making reflected in a competitive format.</w:t>
+      </w:r>
+    </w:p>
+    <w:p>
+      <w:r>
+        <w:pict>
+          <v:rect style="width:0;height:1.5pt" o:hralign="center" o:hrstd="t" o:hr="t"/>
+        </w:pict>
+      </w:r>
+    </w:p>
+    <w:bookmarkEnd w:id="87"/>
+    <w:bookmarkStart w:id="88" w:name="X6069c679aa3d87e90d8ca9c23887c5ccfd208cd"/>
+    <w:p>
+      <w:pPr>
+        <w:pStyle w:val="Heading3"/>
+      </w:pPr>
+      <w:r>
+        <w:t xml:space="preserve">SUGGESTION 2:</w:t>
+      </w:r>
+      <w:r>
+        <w:t xml:space="preserve"> </w:t>
+      </w:r>
+      <w:r>
+        <w:t xml:space="preserve">“CREATOR’S CHOICE”</w:t>
+      </w:r>
+      <w:r>
+        <w:t xml:space="preserve"> </w:t>
+      </w:r>
+      <w:r>
+        <w:t xml:space="preserve">— TALENT REJECTION MECHANIC</w:t>
+      </w:r>
+    </w:p>
+    <w:p>
+      <w:pPr>
+        <w:pStyle w:val="FirstParagraph"/>
+      </w:pPr>
+      <w:r>
+        <w:t xml:space="preserve">After the draft is complete, each selected creator is given 120 seconds to review the brand’s complete brief and, if they choose, reject the partnership. A rejection does not eliminate the brand — it simply removes that creator from their roster and triggers an emergency replacement pick from the remaining pool. However, the rejected creator’s reasoning is recorded on camera and becomes part of the episode’s narrative.</w:t>
+      </w:r>
+    </w:p>
+    <w:p>
+      <w:pPr>
+        <w:pStyle w:val="BodyText"/>
+      </w:pPr>
+      <w:r>
+        <w:t xml:space="preserve">Why this mechanic matters: Creator agency is the most underrepresented perspective in brand partnership narratives. Every existing format — from brand case studies to marketing conferences — tells the story from the brand’s point of view.</w:t>
+      </w:r>
+      <w:r>
+        <w:t xml:space="preserve"> </w:t>
+      </w:r>
+      <w:r>
+        <w:t xml:space="preserve">“Creator’s Choice”</w:t>
+      </w:r>
+      <w:r>
+        <w:t xml:space="preserve"> </w:t>
+      </w:r>
+      <w:r>
+        <w:t xml:space="preserve">gives creators the last word in a format that has been about brands competing for them. A creator who says</w:t>
+      </w:r>
+      <w:r>
+        <w:t xml:space="preserve"> </w:t>
+      </w:r>
+      <w:r>
+        <w:t xml:space="preserve">“I choose not to represent this brand because their values do not align with mine”</w:t>
+      </w:r>
+      <w:r>
+        <w:t xml:space="preserve"> </w:t>
+      </w:r>
+      <w:r>
+        <w:t xml:space="preserve">is making a statement that the audience will feel deeply. A creator who accepts despite reservations is telling a different, equally honest story.</w:t>
+      </w:r>
+    </w:p>
+    <w:p>
+      <w:r>
+        <w:pict>
+          <v:rect style="width:0;height:1.5pt" o:hralign="center" o:hrstd="t" o:hr="t"/>
+        </w:pict>
+      </w:r>
+    </w:p>
+    <w:bookmarkEnd w:id="88"/>
+    <w:bookmarkStart w:id="89" w:name="X8c260ab96305b993f1932ec291b323eee390616"/>
+    <w:p>
+      <w:pPr>
+        <w:pStyle w:val="Heading3"/>
+      </w:pPr>
+      <w:r>
+        <w:t xml:space="preserve">SUGGESTION 3:</w:t>
+      </w:r>
+      <w:r>
+        <w:t xml:space="preserve"> </w:t>
+      </w:r>
+      <w:r>
+        <w:t xml:space="preserve">“THE WILDCARD”</w:t>
+      </w:r>
+      <w:r>
+        <w:t xml:space="preserve"> </w:t>
+      </w:r>
+      <w:r>
+        <w:t xml:space="preserve">— ANONYMOUS CREATOR IN EVERY EPISODE</w:t>
+      </w:r>
+    </w:p>
+    <w:p>
+      <w:pPr>
+        <w:pStyle w:val="FirstParagraph"/>
+      </w:pPr>
+      <w:r>
+        <w:t xml:space="preserve">In every episode of Brand vs. Brand, one creator in the draft pool is presented anonymously — their name, face, and social handles are withheld. The brands see only DealStage platform data: engagement rate, audience demographics, content category, deal history, estimated conversion rates. No follower count. No visual identity. No personal narrative.</w:t>
+      </w:r>
+    </w:p>
+    <w:p>
+      <w:pPr>
+        <w:pStyle w:val="BodyText"/>
+      </w:pPr>
+      <w:r>
+        <w:t xml:space="preserve">The Wildcard tests whether brands can make genuinely data-driven decisions without the influence of personal narrative, aesthetic, or social proof. In early seasons, the Wildcard will consistently be undervalued — brands will pass on strong data because they cannot attach a face to it. As the format matures and brands learn to trust the data, the Wildcard’s draft position will rise — and that change, over multiple seasons, is the show’s most powerful argument for the DealStage platform’s value.</w:t>
+      </w:r>
+    </w:p>
+    <w:p>
+      <w:r>
+        <w:pict>
+          <v:rect style="width:0;height:1.5pt" o:hralign="center" o:hrstd="t" o:hr="t"/>
+        </w:pict>
+      </w:r>
+    </w:p>
+    <w:bookmarkEnd w:id="89"/>
+    <w:bookmarkStart w:id="90" w:name="Xb7f87045cf59c6b8babff50778a0536e18834b9"/>
+    <w:p>
+      <w:pPr>
+        <w:pStyle w:val="Heading3"/>
+      </w:pPr>
+      <w:r>
+        <w:t xml:space="preserve">SUGGESTION 4: CROSS-PROMOTION WITH THE MAIN DEAL STAGE COMPETITION SHOW</w:t>
+      </w:r>
+    </w:p>
+    <w:p>
+      <w:pPr>
+        <w:pStyle w:val="FirstParagraph"/>
+      </w:pPr>
+      <w:r>
+        <w:t xml:space="preserve">Brand vs. Brand and the main Deal Stage competition series share a universe. Two cross-promotional mechanics connect them:</w:t>
+      </w:r>
+    </w:p>
+    <w:p>
+      <w:pPr>
+        <w:pStyle w:val="BodyText"/>
+      </w:pPr>
+      <w:r>
+        <w:t xml:space="preserve">First, creators who appear in Brand vs. Brand (as draft picks) become eligible to compete in the main competition in a subsequent season — they have demonstrated brand fit data in a public format, which gives them a verifiable track record that other competition entrants lack.</w:t>
+      </w:r>
+    </w:p>
+    <w:p>
+      <w:pPr>
+        <w:pStyle w:val="BodyText"/>
+      </w:pPr>
+      <w:r>
+        <w:t xml:space="preserve">Second, brands that perform exceptionally well in Brand vs. Brand (high DealStage ROI scores across their drafted creator portfolio) are invited back as episode partners in the main competition series — they get first-look access to the competition’s creator pool and can make pre-commitments to deals before the episode airs.</w:t>
+      </w:r>
+    </w:p>
+    <w:p>
+      <w:r>
+        <w:pict>
+          <v:rect style="width:0;height:1.5pt" o:hralign="center" o:hrstd="t" o:hr="t"/>
+        </w:pict>
+      </w:r>
+    </w:p>
+    <w:bookmarkEnd w:id="90"/>
+    <w:bookmarkStart w:id="91" w:name="X2d05343d80a5d336d072b7038ffbc91cc654c53"/>
+    <w:p>
+      <w:pPr>
+        <w:pStyle w:val="Heading3"/>
+      </w:pPr>
+      <w:r>
+        <w:t xml:space="preserve">SUGGESTION 5: INTERNATIONAL BRAND MATCHUPS</w:t>
+      </w:r>
+    </w:p>
+    <w:p>
+      <w:pPr>
+        <w:pStyle w:val="FirstParagraph"/>
+      </w:pPr>
+      <w:r>
+        <w:t xml:space="preserve">Season 2 introduces a cross-border variant: Samsung Korea vs. Samsung US competing for the same global creator pool, demonstrating that even the same brand has different regional priorities and creator alignment criteria. This variant is simultaneously a marketing case study (what does regional brand strategy actually mean?) and a competition (which regional team builds the better creator roster?).</w:t>
+      </w:r>
+    </w:p>
+    <w:p>
+      <w:pPr>
+        <w:pStyle w:val="BodyText"/>
+      </w:pPr>
+      <w:r>
+        <w:t xml:space="preserve">The international variant expands from Season 2 onward to include:</w:t>
+      </w:r>
+      <w:r>
+        <w:t xml:space="preserve"> </w:t>
+      </w:r>
+      <w:r>
+        <w:t xml:space="preserve">- McDonald’s US vs. McDonald’s Japan (creator food culture is radically different in each market)</w:t>
+      </w:r>
+      <w:r>
+        <w:t xml:space="preserve"> </w:t>
+      </w:r>
+      <w:r>
+        <w:t xml:space="preserve">- Nike Global vs. Nike China (different athletes, different platforms, different cultural relationships to athletic aspiration)</w:t>
+      </w:r>
+      <w:r>
+        <w:t xml:space="preserve"> </w:t>
+      </w:r>
+      <w:r>
+        <w:t xml:space="preserve">- L’Oreal Paris vs. L’Oreal Korea (K-beauty and French beauty are distinct aesthetic traditions with different creator ecosystems)</w:t>
+      </w:r>
+    </w:p>
+    <w:p>
+      <w:pPr>
+        <w:pStyle w:val="BodyText"/>
+      </w:pPr>
+      <w:r>
+        <w:t xml:space="preserve">Each international matchup doubles as a global market education episode — teaching audiences how the creator economy works differently across cultures while maintaining the competitive format that makes it entertaining.</w:t>
+      </w:r>
+    </w:p>
+    <w:bookmarkEnd w:id="91"/>
+    <w:bookmarkEnd w:id="92"/>
+    <w:bookmarkEnd w:id="93"/>
     <w:sectPr>
       <w:footnotePr>
         <w:numRestart w:val="eachSect"/>
@@ -7639,6 +10396,90 @@
     <w:abstractNumId w:val="991"/>
   </w:num>
   <w:num w:numId="1025">
+    <w:abstractNumId w:val="991"/>
+  </w:num>
+  <w:num w:numId="1026">
+    <w:abstractNumId w:val="991"/>
+  </w:num>
+  <w:num w:numId="1027">
+    <w:abstractNumId w:val="991"/>
+  </w:num>
+  <w:num w:numId="1028">
+    <w:abstractNumId w:val="991"/>
+  </w:num>
+  <w:num w:numId="1029">
+    <w:abstractNumId w:val="991"/>
+  </w:num>
+  <w:num w:numId="1030">
+    <w:abstractNumId w:val="991"/>
+  </w:num>
+  <w:num w:numId="1031">
+    <w:abstractNumId w:val="991"/>
+  </w:num>
+  <w:num w:numId="1032">
+    <w:abstractNumId w:val="991"/>
+  </w:num>
+  <w:num w:numId="1033">
+    <w:abstractNumId w:val="991"/>
+  </w:num>
+  <w:num w:numId="1034">
+    <w:abstractNumId w:val="991"/>
+  </w:num>
+  <w:num w:numId="1035">
+    <w:abstractNumId w:val="991"/>
+  </w:num>
+  <w:num w:numId="1036">
+    <w:abstractNumId w:val="991"/>
+  </w:num>
+  <w:num w:numId="1037">
+    <w:abstractNumId w:val="991"/>
+  </w:num>
+  <w:num w:numId="1038">
+    <w:abstractNumId w:val="991"/>
+  </w:num>
+  <w:num w:numId="1039">
+    <w:abstractNumId w:val="991"/>
+  </w:num>
+  <w:num w:numId="1040">
+    <w:abstractNumId w:val="991"/>
+  </w:num>
+  <w:num w:numId="1041">
+    <w:abstractNumId w:val="991"/>
+  </w:num>
+  <w:num w:numId="1042">
+    <w:abstractNumId w:val="991"/>
+  </w:num>
+  <w:num w:numId="1043">
+    <w:abstractNumId w:val="99411"/>
+    <w:lvlOverride w:ilvl="0">
+      <w:startOverride w:val="1"/>
+    </w:lvlOverride>
+    <w:lvlOverride w:ilvl="1">
+      <w:startOverride w:val="1"/>
+    </w:lvlOverride>
+    <w:lvlOverride w:ilvl="2">
+      <w:startOverride w:val="1"/>
+    </w:lvlOverride>
+    <w:lvlOverride w:ilvl="3">
+      <w:startOverride w:val="1"/>
+    </w:lvlOverride>
+    <w:lvlOverride w:ilvl="4">
+      <w:startOverride w:val="1"/>
+    </w:lvlOverride>
+    <w:lvlOverride w:ilvl="5">
+      <w:startOverride w:val="1"/>
+    </w:lvlOverride>
+    <w:lvlOverride w:ilvl="6">
+      <w:startOverride w:val="1"/>
+    </w:lvlOverride>
+    <w:lvlOverride w:ilvl="7">
+      <w:startOverride w:val="1"/>
+    </w:lvlOverride>
+    <w:lvlOverride w:ilvl="8">
+      <w:startOverride w:val="1"/>
+    </w:lvlOverride>
+  </w:num>
+  <w:num w:numId="1044">
     <w:abstractNumId w:val="991"/>
   </w:num>
 </w:numbering>

</xml_diff>